<commit_message>
14.7 actualizacion de documentos
</commit_message>
<xml_diff>
--- a/Documentación/Documentos/Planes de Gestión - Costos.docx
+++ b/Documentación/Documentos/Planes de Gestión - Costos.docx
@@ -1376,57 +1376,55 @@
     <w:p>
       <w:pPr>
         <w:rPr>
+          <w:lang w:val="es-CL"/>
+        </w:rPr>
+      </w:pPr>
+      <w:r>
+        <w:rPr>
+          <w:lang w:val="es-CL"/>
+        </w:rPr>
+        <w:t xml:space="preserve">Azure </w:t>
+      </w:r>
+      <w:proofErr w:type="spellStart"/>
+      <w:proofErr w:type="gramStart"/>
+      <w:r>
+        <w:rPr>
+          <w:lang w:val="es-CL"/>
+        </w:rPr>
+        <w:t>cloud</w:t>
+      </w:r>
+      <w:proofErr w:type="spellEnd"/>
+      <w:r>
+        <w:rPr>
+          <w:lang w:val="es-CL"/>
+        </w:rPr>
+        <w:t xml:space="preserve"> :</w:t>
+      </w:r>
+      <w:proofErr w:type="gramEnd"/>
+      <w:r>
+        <w:rPr>
+          <w:lang w:val="es-CL"/>
+        </w:rPr>
+        <w:t xml:space="preserve"> capa gratuita $0</w:t>
+      </w:r>
+    </w:p>
+    <w:p>
+      <w:pPr>
+        <w:rPr>
           <w:b/>
           <w:bCs/>
           <w:lang w:val="es-CL"/>
         </w:rPr>
       </w:pPr>
-    </w:p>
-    <w:p>
-      <w:pPr>
-        <w:rPr>
-          <w:lang w:val="es-CL"/>
-        </w:rPr>
-      </w:pPr>
-      <w:r>
-        <w:rPr>
-          <w:lang w:val="es-CL"/>
-        </w:rPr>
-        <w:t>Uso de versiones gratuitas:</w:t>
-      </w:r>
-    </w:p>
-    <w:p>
-      <w:pPr>
-        <w:rPr>
-          <w:lang w:val="es-CL"/>
-        </w:rPr>
-      </w:pPr>
-    </w:p>
-    <w:p>
-      <w:pPr>
-        <w:pStyle w:val="Prrafodelista"/>
-        <w:numPr>
-          <w:ilvl w:val="0"/>
-          <w:numId w:val="4"/>
-        </w:numPr>
-      </w:pPr>
-      <w:r>
-        <w:t>Microsoft Power Apps</w:t>
-      </w:r>
-    </w:p>
-    <w:p>
-      <w:pPr>
-        <w:pStyle w:val="Prrafodelista"/>
-        <w:numPr>
-          <w:ilvl w:val="0"/>
-          <w:numId w:val="4"/>
-        </w:numPr>
-      </w:pPr>
-      <w:r>
-        <w:t>Microsoft Power Pages</w:t>
-      </w:r>
-    </w:p>
-    <w:p/>
+      <w:r>
+        <w:rPr>
+          <w:b/>
+          <w:bCs/>
+          <w:lang w:val="es-CL"/>
+        </w:rPr>
+        <w:t>6. Costos de Infraestructura</w:t>
+      </w:r>
+    </w:p>
     <w:tbl>
       <w:tblPr>
         <w:tblStyle w:val="Tablaconcuadrcula"/>
@@ -1443,9 +1441,21 @@
             <w:tcW w:w="4675" w:type="dxa"/>
           </w:tcPr>
           <w:p>
-            <w:r>
-              <w:t>HERRAMIENTA</w:t>
-            </w:r>
+            <w:pPr>
+              <w:rPr>
+                <w:b/>
+                <w:bCs/>
+              </w:rPr>
+            </w:pPr>
+            <w:proofErr w:type="spellStart"/>
+            <w:r>
+              <w:rPr>
+                <w:b/>
+                <w:bCs/>
+              </w:rPr>
+              <w:t>Recurso</w:t>
+            </w:r>
+            <w:proofErr w:type="spellEnd"/>
           </w:p>
         </w:tc>
         <w:tc>
@@ -1453,9 +1463,21 @@
             <w:tcW w:w="4675" w:type="dxa"/>
           </w:tcPr>
           <w:p>
-            <w:r>
-              <w:t>COSTO</w:t>
-            </w:r>
+            <w:pPr>
+              <w:rPr>
+                <w:b/>
+                <w:bCs/>
+              </w:rPr>
+            </w:pPr>
+            <w:proofErr w:type="spellStart"/>
+            <w:r>
+              <w:rPr>
+                <w:b/>
+                <w:bCs/>
+              </w:rPr>
+              <w:t>Costo</w:t>
+            </w:r>
+            <w:proofErr w:type="spellEnd"/>
           </w:p>
         </w:tc>
       </w:tr>
@@ -1466,7 +1488,31 @@
           </w:tcPr>
           <w:p>
             <w:r>
-              <w:t>Power apps</w:t>
+              <w:t>Hosting (</w:t>
+            </w:r>
+            <w:proofErr w:type="spellStart"/>
+            <w:r>
+              <w:t>incluido</w:t>
+            </w:r>
+            <w:proofErr w:type="spellEnd"/>
+            <w:r>
+              <w:t xml:space="preserve"> </w:t>
+            </w:r>
+            <w:proofErr w:type="spellStart"/>
+            <w:r>
+              <w:t>en</w:t>
+            </w:r>
+            <w:proofErr w:type="spellEnd"/>
+            <w:r>
+              <w:t xml:space="preserve"> </w:t>
+            </w:r>
+            <w:proofErr w:type="spellStart"/>
+            <w:r>
+              <w:t>plataforma</w:t>
+            </w:r>
+            <w:proofErr w:type="spellEnd"/>
+            <w:r>
+              <w:t>)</w:t>
             </w:r>
           </w:p>
         </w:tc>
@@ -1487,8 +1533,13 @@
             <w:tcW w:w="4675" w:type="dxa"/>
           </w:tcPr>
           <w:p>
-            <w:r>
-              <w:t>Power pages</w:t>
+            <w:proofErr w:type="spellStart"/>
+            <w:r>
+              <w:t>Dominio</w:t>
+            </w:r>
+            <w:proofErr w:type="spellEnd"/>
+            <w:r>
+              <w:t xml:space="preserve"> Web</w:t>
             </w:r>
           </w:p>
         </w:tc>
@@ -1498,7 +1549,7 @@
           </w:tcPr>
           <w:p>
             <w:r>
-              <w:t>$0</w:t>
+              <w:t>$15.000</w:t>
             </w:r>
           </w:p>
         </w:tc>
@@ -1510,7 +1561,15 @@
           </w:tcPr>
           <w:p>
             <w:r>
-              <w:t>Draw.io</w:t>
+              <w:t xml:space="preserve">Base de </w:t>
+            </w:r>
+            <w:proofErr w:type="spellStart"/>
+            <w:r>
+              <w:t>datos</w:t>
+            </w:r>
+            <w:proofErr w:type="spellEnd"/>
+            <w:r>
+              <w:t xml:space="preserve"> </w:t>
             </w:r>
           </w:p>
         </w:tc>
@@ -1520,52 +1579,160 @@
           </w:tcPr>
           <w:p>
             <w:r>
-              <w:t>$0</w:t>
+              <w:t>$</w:t>
+            </w:r>
+            <w:r>
+              <w:t>0</w:t>
             </w:r>
           </w:p>
         </w:tc>
       </w:tr>
     </w:tbl>
-    <w:p/>
+    <w:p>
+      <w:pPr>
+        <w:spacing w:before="100" w:beforeAutospacing="1" w:after="100" w:afterAutospacing="1" w:line="240" w:lineRule="auto"/>
+        <w:rPr>
+          <w:rFonts w:ascii="Segoe UI Emoji" w:eastAsia="Times New Roman" w:hAnsi="Segoe UI Emoji" w:cs="Segoe UI Emoji"/>
+          <w:kern w:val="0"/>
+          <w:sz w:val="24"/>
+          <w:szCs w:val="24"/>
+          <w:lang w:val="es-CL"/>
+          <w14:ligatures w14:val="none"/>
+        </w:rPr>
+      </w:pPr>
+      <w:r>
+        <w:rPr>
+          <w:rFonts w:ascii="Segoe UI Emoji" w:eastAsia="Times New Roman" w:hAnsi="Segoe UI Emoji" w:cs="Segoe UI Emoji"/>
+          <w:kern w:val="0"/>
+          <w:sz w:val="24"/>
+          <w:szCs w:val="24"/>
+          <w:lang w:val="es-CL"/>
+          <w14:ligatures w14:val="none"/>
+        </w:rPr>
+        <w:t xml:space="preserve">Base de datos: servicio </w:t>
+      </w:r>
+      <w:proofErr w:type="spellStart"/>
+      <w:r>
+        <w:rPr>
+          <w:rFonts w:ascii="Segoe UI Emoji" w:eastAsia="Times New Roman" w:hAnsi="Segoe UI Emoji" w:cs="Segoe UI Emoji"/>
+          <w:kern w:val="0"/>
+          <w:sz w:val="24"/>
+          <w:szCs w:val="24"/>
+          <w:lang w:val="es-CL"/>
+          <w14:ligatures w14:val="none"/>
+        </w:rPr>
+        <w:t>sql</w:t>
+      </w:r>
+      <w:proofErr w:type="spellEnd"/>
+      <w:r>
+        <w:rPr>
+          <w:rFonts w:ascii="Segoe UI Emoji" w:eastAsia="Times New Roman" w:hAnsi="Segoe UI Emoji" w:cs="Segoe UI Emoji"/>
+          <w:kern w:val="0"/>
+          <w:sz w:val="24"/>
+          <w:szCs w:val="24"/>
+          <w:lang w:val="es-CL"/>
+          <w14:ligatures w14:val="none"/>
+        </w:rPr>
+        <w:t xml:space="preserve"> server con crédito de estudiantes.</w:t>
+      </w:r>
+    </w:p>
+    <w:p>
+      <w:pPr>
+        <w:spacing w:before="100" w:beforeAutospacing="1" w:after="100" w:afterAutospacing="1" w:line="240" w:lineRule="auto"/>
+        <w:rPr>
+          <w:rFonts w:ascii="Segoe UI Emoji" w:eastAsia="Times New Roman" w:hAnsi="Segoe UI Emoji" w:cs="Segoe UI Emoji"/>
+          <w:kern w:val="0"/>
+          <w:sz w:val="24"/>
+          <w:szCs w:val="24"/>
+          <w:lang w:val="es-CL"/>
+          <w14:ligatures w14:val="none"/>
+        </w:rPr>
+      </w:pPr>
+      <w:proofErr w:type="gramStart"/>
+      <w:r>
+        <w:rPr>
+          <w:rFonts w:ascii="Segoe UI Emoji" w:eastAsia="Times New Roman" w:hAnsi="Segoe UI Emoji" w:cs="Segoe UI Emoji"/>
+          <w:kern w:val="0"/>
+          <w:sz w:val="24"/>
+          <w:szCs w:val="24"/>
+          <w:lang w:val="es-CL"/>
+          <w14:ligatures w14:val="none"/>
+        </w:rPr>
+        <w:t>Total</w:t>
+      </w:r>
+      <w:proofErr w:type="gramEnd"/>
+      <w:r>
+        <w:rPr>
+          <w:rFonts w:ascii="Segoe UI Emoji" w:eastAsia="Times New Roman" w:hAnsi="Segoe UI Emoji" w:cs="Segoe UI Emoji"/>
+          <w:kern w:val="0"/>
+          <w:sz w:val="24"/>
+          <w:szCs w:val="24"/>
+          <w:lang w:val="es-CL"/>
+          <w14:ligatures w14:val="none"/>
+        </w:rPr>
+        <w:t xml:space="preserve"> Infraestructura:</w:t>
+      </w:r>
+      <w:r>
+        <w:rPr>
+          <w:rFonts w:ascii="Segoe UI Emoji" w:eastAsia="Times New Roman" w:hAnsi="Segoe UI Emoji" w:cs="Segoe UI Emoji"/>
+          <w:kern w:val="0"/>
+          <w:sz w:val="24"/>
+          <w:szCs w:val="24"/>
+          <w:lang w:val="es-CL"/>
+          <w14:ligatures w14:val="none"/>
+        </w:rPr>
+        <w:t xml:space="preserve">  </w:t>
+      </w:r>
+      <w:r>
+        <w:rPr>
+          <w:rFonts w:ascii="Segoe UI Emoji" w:eastAsia="Times New Roman" w:hAnsi="Segoe UI Emoji" w:cs="Segoe UI Emoji"/>
+          <w:kern w:val="0"/>
+          <w:sz w:val="24"/>
+          <w:szCs w:val="24"/>
+          <w:lang w:val="es-CL"/>
+          <w14:ligatures w14:val="none"/>
+        </w:rPr>
+        <w:t>$</w:t>
+      </w:r>
+      <w:r>
+        <w:rPr>
+          <w:rFonts w:ascii="Segoe UI Emoji" w:eastAsia="Times New Roman" w:hAnsi="Segoe UI Emoji" w:cs="Segoe UI Emoji"/>
+          <w:kern w:val="0"/>
+          <w:sz w:val="24"/>
+          <w:szCs w:val="24"/>
+          <w:lang w:val="es-CL"/>
+          <w14:ligatures w14:val="none"/>
+        </w:rPr>
+        <w:t>1</w:t>
+      </w:r>
+      <w:r>
+        <w:rPr>
+          <w:rFonts w:ascii="Segoe UI Emoji" w:eastAsia="Times New Roman" w:hAnsi="Segoe UI Emoji" w:cs="Segoe UI Emoji"/>
+          <w:kern w:val="0"/>
+          <w:sz w:val="24"/>
+          <w:szCs w:val="24"/>
+          <w:lang w:val="es-CL"/>
+          <w14:ligatures w14:val="none"/>
+        </w:rPr>
+        <w:t>5.000 CL</w:t>
+      </w:r>
+    </w:p>
     <w:p>
       <w:pPr>
         <w:rPr>
           <w:b/>
           <w:bCs/>
+          <w:lang w:val="es-CL"/>
         </w:rPr>
       </w:pPr>
       <w:r>
         <w:rPr>
           <w:b/>
           <w:bCs/>
-        </w:rPr>
-        <w:t xml:space="preserve">6. </w:t>
-      </w:r>
-      <w:proofErr w:type="spellStart"/>
-      <w:r>
-        <w:rPr>
-          <w:b/>
-          <w:bCs/>
-        </w:rPr>
-        <w:t>Costos</w:t>
-      </w:r>
-      <w:proofErr w:type="spellEnd"/>
-      <w:r>
-        <w:rPr>
-          <w:b/>
-          <w:bCs/>
-        </w:rPr>
-        <w:t xml:space="preserve"> de </w:t>
-      </w:r>
-      <w:proofErr w:type="spellStart"/>
-      <w:r>
-        <w:rPr>
-          <w:b/>
-          <w:bCs/>
-        </w:rPr>
-        <w:t>Infraestructura</w:t>
-      </w:r>
-      <w:proofErr w:type="spellEnd"/>
+          <w:lang w:val="es-CL"/>
+        </w:rPr>
+        <w:t>7. Costos de Pruebas y Despliegue</w:t>
+      </w:r>
     </w:p>
     <w:tbl>
       <w:tblPr>
@@ -1587,17 +1754,17 @@
               <w:rPr>
                 <w:b/>
                 <w:bCs/>
-              </w:rPr>
-            </w:pPr>
-            <w:proofErr w:type="spellStart"/>
+                <w:lang w:val="es-CL"/>
+              </w:rPr>
+            </w:pPr>
             <w:r>
               <w:rPr>
                 <w:b/>
                 <w:bCs/>
-              </w:rPr>
-              <w:t>Recurso</w:t>
-            </w:r>
-            <w:proofErr w:type="spellEnd"/>
+                <w:lang w:val="es-CL"/>
+              </w:rPr>
+              <w:t>Actividad</w:t>
+            </w:r>
           </w:p>
         </w:tc>
         <w:tc>
@@ -1609,17 +1776,17 @@
               <w:rPr>
                 <w:b/>
                 <w:bCs/>
-              </w:rPr>
-            </w:pPr>
-            <w:proofErr w:type="spellStart"/>
+                <w:lang w:val="es-CL"/>
+              </w:rPr>
+            </w:pPr>
             <w:r>
               <w:rPr>
                 <w:b/>
                 <w:bCs/>
+                <w:lang w:val="es-CL"/>
               </w:rPr>
               <w:t>Costo</w:t>
             </w:r>
-            <w:proofErr w:type="spellEnd"/>
           </w:p>
         </w:tc>
       </w:tr>
@@ -1629,32 +1796,16 @@
             <w:tcW w:w="4675" w:type="dxa"/>
           </w:tcPr>
           <w:p>
-            <w:r>
-              <w:t>Hosting (</w:t>
-            </w:r>
-            <w:proofErr w:type="spellStart"/>
-            <w:r>
-              <w:t>incluido</w:t>
-            </w:r>
-            <w:proofErr w:type="spellEnd"/>
-            <w:r>
-              <w:t xml:space="preserve"> </w:t>
-            </w:r>
-            <w:proofErr w:type="spellStart"/>
-            <w:r>
-              <w:t>en</w:t>
-            </w:r>
-            <w:proofErr w:type="spellEnd"/>
-            <w:r>
-              <w:t xml:space="preserve"> </w:t>
-            </w:r>
-            <w:proofErr w:type="spellStart"/>
-            <w:r>
-              <w:t>plataforma</w:t>
-            </w:r>
-            <w:proofErr w:type="spellEnd"/>
-            <w:r>
-              <w:t>)</w:t>
+            <w:pPr>
+              <w:rPr>
+                <w:lang w:val="es-CL"/>
+              </w:rPr>
+            </w:pPr>
+            <w:r>
+              <w:rPr>
+                <w:lang w:val="es-CL"/>
+              </w:rPr>
+              <w:t>Pruebas y QA</w:t>
             </w:r>
           </w:p>
         </w:tc>
@@ -1663,8 +1814,16 @@
             <w:tcW w:w="4675" w:type="dxa"/>
           </w:tcPr>
           <w:p>
-            <w:r>
-              <w:t>$0</w:t>
+            <w:pPr>
+              <w:rPr>
+                <w:lang w:val="es-CL"/>
+              </w:rPr>
+            </w:pPr>
+            <w:r>
+              <w:rPr>
+                <w:lang w:val="es-CL"/>
+              </w:rPr>
+              <w:t>Incluido en RRHH</w:t>
             </w:r>
           </w:p>
         </w:tc>
@@ -1675,13 +1834,16 @@
             <w:tcW w:w="4675" w:type="dxa"/>
           </w:tcPr>
           <w:p>
-            <w:proofErr w:type="spellStart"/>
-            <w:r>
-              <w:t>Dominio</w:t>
-            </w:r>
-            <w:proofErr w:type="spellEnd"/>
-            <w:r>
-              <w:t xml:space="preserve"> Web</w:t>
+            <w:pPr>
+              <w:rPr>
+                <w:lang w:val="es-CL"/>
+              </w:rPr>
+            </w:pPr>
+            <w:r>
+              <w:rPr>
+                <w:lang w:val="es-CL"/>
+              </w:rPr>
+              <w:t>Correcciones</w:t>
             </w:r>
           </w:p>
         </w:tc>
@@ -1690,8 +1852,16 @@
             <w:tcW w:w="4675" w:type="dxa"/>
           </w:tcPr>
           <w:p>
-            <w:r>
-              <w:t>$15.000</w:t>
+            <w:pPr>
+              <w:rPr>
+                <w:lang w:val="es-CL"/>
+              </w:rPr>
+            </w:pPr>
+            <w:r>
+              <w:rPr>
+                <w:lang w:val="es-CL"/>
+              </w:rPr>
+              <w:t>Incluido en RRHH</w:t>
             </w:r>
           </w:p>
         </w:tc>
@@ -1702,16 +1872,16 @@
             <w:tcW w:w="4675" w:type="dxa"/>
           </w:tcPr>
           <w:p>
-            <w:r>
-              <w:t xml:space="preserve">Base de </w:t>
-            </w:r>
-            <w:proofErr w:type="spellStart"/>
-            <w:r>
-              <w:t>datos</w:t>
-            </w:r>
-            <w:proofErr w:type="spellEnd"/>
-            <w:r>
-              <w:t xml:space="preserve"> </w:t>
+            <w:pPr>
+              <w:rPr>
+                <w:lang w:val="es-CL"/>
+              </w:rPr>
+            </w:pPr>
+            <w:r>
+              <w:rPr>
+                <w:lang w:val="es-CL"/>
+              </w:rPr>
+              <w:t>Despliegue final</w:t>
             </w:r>
           </w:p>
         </w:tc>
@@ -1720,11 +1890,16 @@
             <w:tcW w:w="4675" w:type="dxa"/>
           </w:tcPr>
           <w:p>
-            <w:r>
-              <w:t>$</w:t>
-            </w:r>
-            <w:r>
-              <w:t>0</w:t>
+            <w:pPr>
+              <w:rPr>
+                <w:lang w:val="es-CL"/>
+              </w:rPr>
+            </w:pPr>
+            <w:r>
+              <w:rPr>
+                <w:lang w:val="es-CL"/>
+              </w:rPr>
+              <w:t>$50.000</w:t>
             </w:r>
           </w:p>
         </w:tc>
@@ -1732,188 +1907,70 @@
     </w:tbl>
     <w:p>
       <w:pPr>
-        <w:spacing w:before="100" w:beforeAutospacing="1" w:after="100" w:afterAutospacing="1" w:line="240" w:lineRule="auto"/>
-        <w:rPr>
-          <w:rFonts w:ascii="Segoe UI Emoji" w:eastAsia="Times New Roman" w:hAnsi="Segoe UI Emoji" w:cs="Segoe UI Emoji"/>
-          <w:kern w:val="0"/>
-          <w:sz w:val="24"/>
-          <w:szCs w:val="24"/>
-          <w:lang w:val="es-CL"/>
-          <w14:ligatures w14:val="none"/>
-        </w:rPr>
-      </w:pPr>
-      <w:r>
-        <w:rPr>
-          <w:rFonts w:ascii="Segoe UI Emoji" w:eastAsia="Times New Roman" w:hAnsi="Segoe UI Emoji" w:cs="Segoe UI Emoji"/>
-          <w:kern w:val="0"/>
-          <w:sz w:val="24"/>
-          <w:szCs w:val="24"/>
-          <w:lang w:val="es-CL"/>
-          <w14:ligatures w14:val="none"/>
-        </w:rPr>
-        <w:t xml:space="preserve">Base de datos: servicio </w:t>
-      </w:r>
-      <w:proofErr w:type="spellStart"/>
-      <w:r>
-        <w:rPr>
-          <w:rFonts w:ascii="Segoe UI Emoji" w:eastAsia="Times New Roman" w:hAnsi="Segoe UI Emoji" w:cs="Segoe UI Emoji"/>
-          <w:kern w:val="0"/>
-          <w:sz w:val="24"/>
-          <w:szCs w:val="24"/>
-          <w:lang w:val="es-CL"/>
-          <w14:ligatures w14:val="none"/>
-        </w:rPr>
-        <w:t>sql</w:t>
-      </w:r>
-      <w:proofErr w:type="spellEnd"/>
-      <w:r>
-        <w:rPr>
-          <w:rFonts w:ascii="Segoe UI Emoji" w:eastAsia="Times New Roman" w:hAnsi="Segoe UI Emoji" w:cs="Segoe UI Emoji"/>
-          <w:kern w:val="0"/>
-          <w:sz w:val="24"/>
-          <w:szCs w:val="24"/>
-          <w:lang w:val="es-CL"/>
-          <w14:ligatures w14:val="none"/>
-        </w:rPr>
-        <w:t xml:space="preserve"> server con crédito de estudiantes.</w:t>
-      </w:r>
-    </w:p>
-    <w:p>
-      <w:pPr>
-        <w:spacing w:before="100" w:beforeAutospacing="1" w:after="100" w:afterAutospacing="1" w:line="240" w:lineRule="auto"/>
-        <w:rPr>
-          <w:rFonts w:ascii="Segoe UI Emoji" w:eastAsia="Times New Roman" w:hAnsi="Segoe UI Emoji" w:cs="Segoe UI Emoji"/>
-          <w:kern w:val="0"/>
-          <w:sz w:val="24"/>
-          <w:szCs w:val="24"/>
-          <w:lang w:val="es-CL"/>
-          <w14:ligatures w14:val="none"/>
-        </w:rPr>
-      </w:pPr>
-      <w:proofErr w:type="gramStart"/>
-      <w:r>
-        <w:rPr>
-          <w:rFonts w:ascii="Segoe UI Emoji" w:eastAsia="Times New Roman" w:hAnsi="Segoe UI Emoji" w:cs="Segoe UI Emoji"/>
-          <w:kern w:val="0"/>
-          <w:sz w:val="24"/>
-          <w:szCs w:val="24"/>
-          <w:lang w:val="es-CL"/>
-          <w14:ligatures w14:val="none"/>
-        </w:rPr>
-        <w:t>Total</w:t>
-      </w:r>
-      <w:proofErr w:type="gramEnd"/>
-      <w:r>
-        <w:rPr>
-          <w:rFonts w:ascii="Segoe UI Emoji" w:eastAsia="Times New Roman" w:hAnsi="Segoe UI Emoji" w:cs="Segoe UI Emoji"/>
-          <w:kern w:val="0"/>
-          <w:sz w:val="24"/>
-          <w:szCs w:val="24"/>
-          <w:lang w:val="es-CL"/>
-          <w14:ligatures w14:val="none"/>
-        </w:rPr>
-        <w:t xml:space="preserve"> Infraestructura:</w:t>
-      </w:r>
-      <w:r>
-        <w:rPr>
-          <w:rFonts w:ascii="Segoe UI Emoji" w:eastAsia="Times New Roman" w:hAnsi="Segoe UI Emoji" w:cs="Segoe UI Emoji"/>
-          <w:kern w:val="0"/>
-          <w:sz w:val="24"/>
-          <w:szCs w:val="24"/>
-          <w:lang w:val="es-CL"/>
-          <w14:ligatures w14:val="none"/>
-        </w:rPr>
-        <w:t xml:space="preserve">  </w:t>
-      </w:r>
-      <w:r>
-        <w:rPr>
-          <w:rFonts w:ascii="Segoe UI Emoji" w:eastAsia="Times New Roman" w:hAnsi="Segoe UI Emoji" w:cs="Segoe UI Emoji"/>
-          <w:kern w:val="0"/>
-          <w:sz w:val="24"/>
-          <w:szCs w:val="24"/>
-          <w:lang w:val="es-CL"/>
-          <w14:ligatures w14:val="none"/>
-        </w:rPr>
-        <w:t>$</w:t>
-      </w:r>
-      <w:r>
-        <w:rPr>
-          <w:rFonts w:ascii="Segoe UI Emoji" w:eastAsia="Times New Roman" w:hAnsi="Segoe UI Emoji" w:cs="Segoe UI Emoji"/>
-          <w:kern w:val="0"/>
-          <w:sz w:val="24"/>
-          <w:szCs w:val="24"/>
-          <w:lang w:val="es-CL"/>
-          <w14:ligatures w14:val="none"/>
-        </w:rPr>
-        <w:t>1</w:t>
-      </w:r>
-      <w:r>
-        <w:rPr>
-          <w:rFonts w:ascii="Segoe UI Emoji" w:eastAsia="Times New Roman" w:hAnsi="Segoe UI Emoji" w:cs="Segoe UI Emoji"/>
-          <w:kern w:val="0"/>
-          <w:sz w:val="24"/>
-          <w:szCs w:val="24"/>
-          <w:lang w:val="es-CL"/>
-          <w14:ligatures w14:val="none"/>
-        </w:rPr>
-        <w:t>5.000 CL</w:t>
-      </w:r>
-    </w:p>
-    <w:p>
-      <w:pPr>
         <w:rPr>
           <w:b/>
           <w:bCs/>
-        </w:rPr>
-      </w:pPr>
-      <w:r>
+          <w:lang w:val="es-CL"/>
+        </w:rPr>
+      </w:pPr>
+    </w:p>
+    <w:p>
+      <w:pPr>
+        <w:rPr>
+          <w:lang w:val="es-CL"/>
+        </w:rPr>
+      </w:pPr>
+      <w:proofErr w:type="gramStart"/>
+      <w:r>
+        <w:rPr>
+          <w:lang w:val="es-CL"/>
+        </w:rPr>
+        <w:t>Total</w:t>
+      </w:r>
+      <w:proofErr w:type="gramEnd"/>
+      <w:r>
+        <w:rPr>
+          <w:lang w:val="es-CL"/>
+        </w:rPr>
+        <w:t xml:space="preserve"> Pruebas:  $50.000 CLP</w:t>
+      </w:r>
+    </w:p>
+    <w:p>
+      <w:pPr>
+        <w:rPr>
+          <w:lang w:val="es-CL"/>
+        </w:rPr>
+      </w:pPr>
+    </w:p>
+    <w:p>
+      <w:pPr>
         <w:rPr>
           <w:b/>
           <w:bCs/>
-        </w:rPr>
-        <w:t xml:space="preserve">7. </w:t>
-      </w:r>
-      <w:proofErr w:type="spellStart"/>
+          <w:lang w:val="es-CL"/>
+        </w:rPr>
+      </w:pPr>
       <w:r>
         <w:rPr>
           <w:b/>
           <w:bCs/>
-        </w:rPr>
-        <w:t>Costos</w:t>
-      </w:r>
-      <w:proofErr w:type="spellEnd"/>
-      <w:r>
-        <w:rPr>
-          <w:b/>
-          <w:bCs/>
-        </w:rPr>
-        <w:t xml:space="preserve"> de </w:t>
-      </w:r>
-      <w:proofErr w:type="spellStart"/>
-      <w:r>
-        <w:rPr>
-          <w:b/>
-          <w:bCs/>
-        </w:rPr>
-        <w:t>Pruebas</w:t>
-      </w:r>
-      <w:proofErr w:type="spellEnd"/>
-      <w:r>
-        <w:rPr>
-          <w:b/>
-          <w:bCs/>
-        </w:rPr>
-        <w:t xml:space="preserve"> y </w:t>
-      </w:r>
-      <w:proofErr w:type="spellStart"/>
-      <w:r>
-        <w:rPr>
-          <w:b/>
-          <w:bCs/>
-        </w:rPr>
-        <w:t>Despliegue</w:t>
-      </w:r>
-      <w:proofErr w:type="spellEnd"/>
+          <w:lang w:val="es-CL"/>
+        </w:rPr>
+        <w:t>7. Costos Operacionales</w:t>
+      </w:r>
+    </w:p>
+    <w:p>
+      <w:pPr>
+        <w:rPr>
+          <w:lang w:val="es-CL"/>
+        </w:rPr>
+      </w:pPr>
+      <w:r>
+        <w:rPr>
+          <w:lang w:val="es-CL"/>
+        </w:rPr>
+        <w:t>En este proyecto, se considera principalmente el costo de conectividad a internet utilizado por el equipo de trabajo.</w:t>
+      </w:r>
     </w:p>
     <w:tbl>
       <w:tblPr>
@@ -1944,7 +2001,7 @@
                 <w:bCs/>
                 <w:lang w:val="es-CL"/>
               </w:rPr>
-              <w:t>Actividad</w:t>
+              <w:t xml:space="preserve">Recurso </w:t>
             </w:r>
           </w:p>
         </w:tc>
@@ -1986,7 +2043,7 @@
               <w:rPr>
                 <w:lang w:val="es-CL"/>
               </w:rPr>
-              <w:t>Pruebas y QA</w:t>
+              <w:t xml:space="preserve">Internet </w:t>
             </w:r>
           </w:p>
         </w:tc>
@@ -2004,83 +2061,7 @@
               <w:rPr>
                 <w:lang w:val="es-CL"/>
               </w:rPr>
-              <w:t>Incluido en RRHH</w:t>
-            </w:r>
-          </w:p>
-        </w:tc>
-      </w:tr>
-      <w:tr>
-        <w:tc>
-          <w:tcPr>
-            <w:tcW w:w="4675" w:type="dxa"/>
-          </w:tcPr>
-          <w:p>
-            <w:pPr>
-              <w:rPr>
-                <w:lang w:val="es-CL"/>
-              </w:rPr>
-            </w:pPr>
-            <w:r>
-              <w:rPr>
-                <w:lang w:val="es-CL"/>
-              </w:rPr>
-              <w:t>Correcciones</w:t>
-            </w:r>
-          </w:p>
-        </w:tc>
-        <w:tc>
-          <w:tcPr>
-            <w:tcW w:w="4675" w:type="dxa"/>
-          </w:tcPr>
-          <w:p>
-            <w:pPr>
-              <w:rPr>
-                <w:lang w:val="es-CL"/>
-              </w:rPr>
-            </w:pPr>
-            <w:r>
-              <w:rPr>
-                <w:lang w:val="es-CL"/>
-              </w:rPr>
-              <w:t>Incluido en RRHH</w:t>
-            </w:r>
-          </w:p>
-        </w:tc>
-      </w:tr>
-      <w:tr>
-        <w:tc>
-          <w:tcPr>
-            <w:tcW w:w="4675" w:type="dxa"/>
-          </w:tcPr>
-          <w:p>
-            <w:pPr>
-              <w:rPr>
-                <w:lang w:val="es-CL"/>
-              </w:rPr>
-            </w:pPr>
-            <w:r>
-              <w:rPr>
-                <w:lang w:val="es-CL"/>
-              </w:rPr>
-              <w:t>Despliegue final</w:t>
-            </w:r>
-          </w:p>
-        </w:tc>
-        <w:tc>
-          <w:tcPr>
-            <w:tcW w:w="4675" w:type="dxa"/>
-          </w:tcPr>
-          <w:p>
-            <w:pPr>
-              <w:rPr>
-                <w:lang w:val="es-CL"/>
-              </w:rPr>
-            </w:pPr>
-            <w:r>
-              <w:rPr>
-                <w:lang w:val="es-CL"/>
-              </w:rPr>
-              <w:t>$50.000</w:t>
+              <w:t>$60.000</w:t>
             </w:r>
           </w:p>
         </w:tc>
@@ -2089,68 +2070,25 @@
     <w:p>
       <w:pPr>
         <w:rPr>
+          <w:lang w:val="es-CL"/>
+        </w:rPr>
+      </w:pPr>
+    </w:p>
+    <w:p>
+      <w:pPr>
+        <w:rPr>
           <w:b/>
           <w:bCs/>
           <w:lang w:val="es-CL"/>
         </w:rPr>
       </w:pPr>
-    </w:p>
-    <w:p>
-      <w:pPr>
-        <w:rPr>
-          <w:lang w:val="es-CL"/>
-        </w:rPr>
-      </w:pPr>
-      <w:proofErr w:type="gramStart"/>
-      <w:r>
-        <w:rPr>
-          <w:lang w:val="es-CL"/>
-        </w:rPr>
-        <w:t>Total</w:t>
-      </w:r>
-      <w:proofErr w:type="gramEnd"/>
-      <w:r>
-        <w:rPr>
-          <w:lang w:val="es-CL"/>
-        </w:rPr>
-        <w:t xml:space="preserve"> Pruebas:  $50.000 CLP</w:t>
-      </w:r>
-    </w:p>
-    <w:p>
-      <w:pPr>
-        <w:rPr>
-          <w:lang w:val="es-CL"/>
-        </w:rPr>
-      </w:pPr>
-    </w:p>
-    <w:p>
-      <w:pPr>
+      <w:r>
         <w:rPr>
           <w:b/>
           <w:bCs/>
           <w:lang w:val="es-CL"/>
         </w:rPr>
-      </w:pPr>
-      <w:r>
-        <w:rPr>
-          <w:b/>
-          <w:bCs/>
-          <w:lang w:val="es-CL"/>
-        </w:rPr>
-        <w:t>7. Costos Operacionales</w:t>
-      </w:r>
-    </w:p>
-    <w:p>
-      <w:pPr>
-        <w:rPr>
-          <w:lang w:val="es-CL"/>
-        </w:rPr>
-      </w:pPr>
-      <w:r>
-        <w:rPr>
-          <w:lang w:val="es-CL"/>
-        </w:rPr>
-        <w:t>En este proyecto, se considera principalmente el costo de conectividad a internet utilizado por el equipo de trabajo.</w:t>
+        <w:t>8. COSTO TOTAL DEL PROYECTO</w:t>
       </w:r>
     </w:p>
     <w:tbl>
@@ -2182,7 +2120,7 @@
                 <w:bCs/>
                 <w:lang w:val="es-CL"/>
               </w:rPr>
-              <w:t xml:space="preserve">Recurso </w:t>
+              <w:t>Categoría</w:t>
             </w:r>
           </w:p>
         </w:tc>
@@ -2204,7 +2142,7 @@
                 <w:bCs/>
                 <w:lang w:val="es-CL"/>
               </w:rPr>
-              <w:t>Costo</w:t>
+              <w:t>Total</w:t>
             </w:r>
           </w:p>
         </w:tc>
@@ -2224,7 +2162,164 @@
               <w:rPr>
                 <w:lang w:val="es-CL"/>
               </w:rPr>
-              <w:t xml:space="preserve">Internet </w:t>
+              <w:t>Recursos Humanos</w:t>
+            </w:r>
+          </w:p>
+        </w:tc>
+        <w:tc>
+          <w:tcPr>
+            <w:tcW w:w="4675" w:type="dxa"/>
+          </w:tcPr>
+          <w:p>
+            <w:pPr>
+              <w:rPr>
+                <w:lang w:val="es-CL"/>
+              </w:rPr>
+            </w:pPr>
+            <w:r>
+              <w:t>$15.600.000</w:t>
+            </w:r>
+          </w:p>
+        </w:tc>
+      </w:tr>
+      <w:tr>
+        <w:tc>
+          <w:tcPr>
+            <w:tcW w:w="4675" w:type="dxa"/>
+          </w:tcPr>
+          <w:p>
+            <w:pPr>
+              <w:rPr>
+                <w:lang w:val="es-CL"/>
+              </w:rPr>
+            </w:pPr>
+            <w:r>
+              <w:rPr>
+                <w:lang w:val="es-CL"/>
+              </w:rPr>
+              <w:t>Herramientas</w:t>
+            </w:r>
+          </w:p>
+        </w:tc>
+        <w:tc>
+          <w:tcPr>
+            <w:tcW w:w="4675" w:type="dxa"/>
+          </w:tcPr>
+          <w:p>
+            <w:pPr>
+              <w:rPr>
+                <w:lang w:val="es-CL"/>
+              </w:rPr>
+            </w:pPr>
+            <w:r>
+              <w:rPr>
+                <w:lang w:val="es-CL"/>
+              </w:rPr>
+              <w:t>$0</w:t>
+            </w:r>
+          </w:p>
+        </w:tc>
+      </w:tr>
+      <w:tr>
+        <w:tc>
+          <w:tcPr>
+            <w:tcW w:w="4675" w:type="dxa"/>
+          </w:tcPr>
+          <w:p>
+            <w:pPr>
+              <w:rPr>
+                <w:lang w:val="es-CL"/>
+              </w:rPr>
+            </w:pPr>
+            <w:r>
+              <w:rPr>
+                <w:lang w:val="es-CL"/>
+              </w:rPr>
+              <w:t>Infraestructura</w:t>
+            </w:r>
+          </w:p>
+        </w:tc>
+        <w:tc>
+          <w:tcPr>
+            <w:tcW w:w="4675" w:type="dxa"/>
+          </w:tcPr>
+          <w:p>
+            <w:pPr>
+              <w:rPr>
+                <w:lang w:val="es-CL"/>
+              </w:rPr>
+            </w:pPr>
+            <w:r>
+              <w:t>$</w:t>
+            </w:r>
+            <w:r>
+              <w:t>15.000</w:t>
+            </w:r>
+          </w:p>
+        </w:tc>
+      </w:tr>
+      <w:tr>
+        <w:tc>
+          <w:tcPr>
+            <w:tcW w:w="4675" w:type="dxa"/>
+          </w:tcPr>
+          <w:p>
+            <w:pPr>
+              <w:rPr>
+                <w:lang w:val="es-CL"/>
+              </w:rPr>
+            </w:pPr>
+            <w:r>
+              <w:rPr>
+                <w:lang w:val="es-CL"/>
+              </w:rPr>
+              <w:t xml:space="preserve">Pruebas y </w:t>
+            </w:r>
+            <w:proofErr w:type="spellStart"/>
+            <w:r>
+              <w:rPr>
+                <w:lang w:val="es-CL"/>
+              </w:rPr>
+              <w:t>Despligue</w:t>
+            </w:r>
+            <w:proofErr w:type="spellEnd"/>
+          </w:p>
+        </w:tc>
+        <w:tc>
+          <w:tcPr>
+            <w:tcW w:w="4675" w:type="dxa"/>
+          </w:tcPr>
+          <w:p>
+            <w:pPr>
+              <w:rPr>
+                <w:lang w:val="es-CL"/>
+              </w:rPr>
+            </w:pPr>
+            <w:r>
+              <w:rPr>
+                <w:lang w:val="es-CL"/>
+              </w:rPr>
+              <w:t>$50.000</w:t>
+            </w:r>
+          </w:p>
+        </w:tc>
+      </w:tr>
+      <w:tr>
+        <w:tc>
+          <w:tcPr>
+            <w:tcW w:w="4675" w:type="dxa"/>
+          </w:tcPr>
+          <w:p>
+            <w:pPr>
+              <w:rPr>
+                <w:lang w:val="es-CL"/>
+              </w:rPr>
+            </w:pPr>
+            <w:r>
+              <w:rPr>
+                <w:lang w:val="es-CL"/>
+              </w:rPr>
+              <w:t xml:space="preserve">Operacionales </w:t>
             </w:r>
           </w:p>
         </w:tc>
@@ -2251,26 +2346,603 @@
     <w:p>
       <w:pPr>
         <w:rPr>
-          <w:lang w:val="es-CL"/>
-        </w:rPr>
-      </w:pPr>
-    </w:p>
-    <w:p>
-      <w:pPr>
-        <w:rPr>
           <w:b/>
           <w:bCs/>
           <w:lang w:val="es-CL"/>
         </w:rPr>
       </w:pPr>
-      <w:r>
+    </w:p>
+    <w:p>
+      <w:pPr>
         <w:rPr>
           <w:b/>
           <w:bCs/>
           <w:lang w:val="es-CL"/>
         </w:rPr>
+      </w:pPr>
+      <w:proofErr w:type="gramStart"/>
+      <w:r>
+        <w:rPr>
+          <w:b/>
+          <w:bCs/>
+          <w:lang w:val="es-CL"/>
+        </w:rPr>
+        <w:t>TOTAL</w:t>
+      </w:r>
+      <w:proofErr w:type="gramEnd"/>
+      <w:r>
+        <w:rPr>
+          <w:b/>
+          <w:bCs/>
+          <w:lang w:val="es-CL"/>
+        </w:rPr>
+        <w:t xml:space="preserve"> GENERAL:</w:t>
+      </w:r>
+      <w:r>
+        <w:rPr>
+          <w:b/>
+          <w:bCs/>
+          <w:lang w:val="es-CL"/>
+        </w:rPr>
+        <w:t xml:space="preserve"> </w:t>
+      </w:r>
+      <w:r>
+        <w:rPr>
+          <w:b/>
+          <w:bCs/>
+          <w:lang w:val="es-CL"/>
+        </w:rPr>
+        <w:t>$15.725.000 CLP</w:t>
+      </w:r>
+    </w:p>
+    <w:p>
+      <w:pPr>
+        <w:rPr>
+          <w:b/>
+          <w:bCs/>
+          <w:lang w:val="es-CL"/>
+        </w:rPr>
+      </w:pPr>
+      <w:r>
+        <w:rPr>
+          <w:b/>
+          <w:bCs/>
+          <w:lang w:val="es-CL"/>
+        </w:rPr>
+        <w:t xml:space="preserve">9. </w:t>
+      </w:r>
+      <w:r>
+        <w:rPr>
+          <w:b/>
+          <w:bCs/>
+          <w:lang w:val="es-CL"/>
+        </w:rPr>
+        <w:t>Reserva por Imprevistos (8%)</w:t>
+      </w:r>
+    </w:p>
+    <w:p>
+      <w:pPr>
+        <w:rPr>
+          <w:lang w:val="es-CL"/>
+        </w:rPr>
+      </w:pPr>
+      <w:r>
+        <w:rPr>
+          <w:lang w:val="es-CL"/>
+        </w:rPr>
         <w:lastRenderedPageBreak/>
-        <w:t>8. COSTO TOTAL DEL PROYECTO</w:t>
+        <w:t>Se considera un 8% adicional del costo total del proyecto para cubrir posibles imprevistos, tales como retrasos, errores técnicos o necesidades adicionales.</w:t>
+      </w:r>
+    </w:p>
+    <w:p>
+      <w:pPr>
+        <w:pStyle w:val="Prrafodelista"/>
+        <w:numPr>
+          <w:ilvl w:val="0"/>
+          <w:numId w:val="5"/>
+        </w:numPr>
+        <w:rPr>
+          <w:lang w:val="es-CL"/>
+        </w:rPr>
+      </w:pPr>
+      <w:r>
+        <w:rPr>
+          <w:lang w:val="es-CL"/>
+        </w:rPr>
+        <w:t xml:space="preserve">8% de </w:t>
+      </w:r>
+      <w:r>
+        <w:t xml:space="preserve">$15.725.000 </w:t>
+      </w:r>
+      <w:r>
+        <w:rPr>
+          <w:lang w:val="es-CL"/>
+        </w:rPr>
+        <w:t xml:space="preserve">= </w:t>
+      </w:r>
+      <w:r>
+        <w:t xml:space="preserve">$1.258.000 </w:t>
+      </w:r>
+      <w:r>
+        <w:rPr>
+          <w:lang w:val="es-CL"/>
+        </w:rPr>
+        <w:t>CL</w:t>
+      </w:r>
+    </w:p>
+    <w:p>
+      <w:pPr>
+        <w:rPr>
+          <w:u w:val="single"/>
+          <w:lang w:val="es-CL"/>
+        </w:rPr>
+      </w:pPr>
+      <w:r>
+        <w:rPr>
+          <w:u w:val="single"/>
+          <w:lang w:val="es-CL"/>
+        </w:rPr>
+        <w:t>COSTO TOTAL FINAL DEL PROYECTO</w:t>
+      </w:r>
+    </w:p>
+    <w:p>
+      <w:pPr>
+        <w:rPr>
+          <w:b/>
+          <w:bCs/>
+          <w:lang w:val="es-CL"/>
+        </w:rPr>
+      </w:pPr>
+      <w:r>
+        <w:rPr>
+          <w:b/>
+          <w:bCs/>
+          <w:lang w:val="es-CL"/>
+        </w:rPr>
+        <w:t>$16.983.000 CLP</w:t>
+      </w:r>
+    </w:p>
+    <w:p>
+      <w:pPr>
+        <w:rPr>
+          <w:b/>
+          <w:bCs/>
+          <w:lang w:val="es-CL"/>
+        </w:rPr>
+      </w:pPr>
+    </w:p>
+    <w:p>
+      <w:pPr>
+        <w:jc w:val="center"/>
+        <w:rPr>
+          <w:b/>
+          <w:bCs/>
+          <w:lang w:val="es-CL"/>
+        </w:rPr>
+      </w:pPr>
+      <w:r>
+        <w:rPr>
+          <w:b/>
+          <w:bCs/>
+          <w:lang w:val="es-CL"/>
+        </w:rPr>
+        <w:t xml:space="preserve">10. </w:t>
+      </w:r>
+      <w:r>
+        <w:rPr>
+          <w:b/>
+          <w:bCs/>
+          <w:lang w:val="es-CL"/>
+        </w:rPr>
+        <w:t>Informe Financiero Proyectado</w:t>
+      </w:r>
+    </w:p>
+    <w:p>
+      <w:pPr>
+        <w:rPr>
+          <w:b/>
+          <w:bCs/>
+          <w:lang w:val="es-CL"/>
+        </w:rPr>
+      </w:pPr>
+      <w:r>
+        <w:rPr>
+          <w:b/>
+          <w:bCs/>
+          <w:lang w:val="es-CL"/>
+        </w:rPr>
+        <w:t>Datos considerados</w:t>
+      </w:r>
+    </w:p>
+    <w:p>
+      <w:pPr>
+        <w:pStyle w:val="Prrafodelista"/>
+        <w:numPr>
+          <w:ilvl w:val="0"/>
+          <w:numId w:val="5"/>
+        </w:numPr>
+        <w:rPr>
+          <w:lang w:val="es-CL"/>
+        </w:rPr>
+      </w:pPr>
+      <w:r>
+        <w:rPr>
+          <w:lang w:val="es-CL"/>
+        </w:rPr>
+        <w:t>Inversión inicial: $17.000.000 CLP</w:t>
+      </w:r>
+    </w:p>
+    <w:p>
+      <w:pPr>
+        <w:pStyle w:val="Prrafodelista"/>
+        <w:numPr>
+          <w:ilvl w:val="0"/>
+          <w:numId w:val="5"/>
+        </w:numPr>
+        <w:rPr>
+          <w:lang w:val="es-CL"/>
+        </w:rPr>
+      </w:pPr>
+      <w:r>
+        <w:rPr>
+          <w:lang w:val="es-CL"/>
+        </w:rPr>
+        <w:t>Comisión de la plataforma: 5%</w:t>
+      </w:r>
+    </w:p>
+    <w:p>
+      <w:pPr>
+        <w:pStyle w:val="Prrafodelista"/>
+        <w:numPr>
+          <w:ilvl w:val="0"/>
+          <w:numId w:val="5"/>
+        </w:numPr>
+        <w:rPr>
+          <w:lang w:val="es-CL"/>
+        </w:rPr>
+      </w:pPr>
+      <w:r>
+        <w:rPr>
+          <w:lang w:val="es-CL"/>
+        </w:rPr>
+        <w:t>Precio promedio por servicio: $11.000</w:t>
+      </w:r>
+    </w:p>
+    <w:p>
+      <w:pPr>
+        <w:pStyle w:val="Prrafodelista"/>
+        <w:numPr>
+          <w:ilvl w:val="0"/>
+          <w:numId w:val="5"/>
+        </w:numPr>
+        <w:rPr>
+          <w:lang w:val="es-CL"/>
+        </w:rPr>
+      </w:pPr>
+      <w:r>
+        <w:rPr>
+          <w:lang w:val="es-CL"/>
+        </w:rPr>
+        <w:t>Servicios promedio por barbería: 219 al mes</w:t>
+      </w:r>
+    </w:p>
+    <w:p>
+      <w:pPr>
+        <w:pStyle w:val="Prrafodelista"/>
+        <w:rPr>
+          <w:lang w:val="es-CL"/>
+        </w:rPr>
+      </w:pPr>
+    </w:p>
+    <w:p>
+      <w:pPr>
+        <w:rPr>
+          <w:b/>
+          <w:bCs/>
+          <w:lang w:val="es-CL"/>
+        </w:rPr>
+      </w:pPr>
+      <w:r>
+        <w:rPr>
+          <w:b/>
+          <w:bCs/>
+          <w:lang w:val="es-CL"/>
+        </w:rPr>
+        <w:t>Ingresos de una barbería</w:t>
+      </w:r>
+    </w:p>
+    <w:p>
+      <w:pPr>
+        <w:pStyle w:val="Prrafodelista"/>
+        <w:numPr>
+          <w:ilvl w:val="0"/>
+          <w:numId w:val="6"/>
+        </w:numPr>
+        <w:rPr>
+          <w:lang w:val="es-CL"/>
+        </w:rPr>
+      </w:pPr>
+      <w:r>
+        <w:rPr>
+          <w:lang w:val="es-CL"/>
+        </w:rPr>
+        <w:t>219 servicios × $11.000</w:t>
+      </w:r>
+    </w:p>
+    <w:p>
+      <w:pPr>
+        <w:pStyle w:val="Prrafodelista"/>
+        <w:numPr>
+          <w:ilvl w:val="0"/>
+          <w:numId w:val="6"/>
+        </w:numPr>
+        <w:rPr>
+          <w:lang w:val="es-CL"/>
+        </w:rPr>
+      </w:pPr>
+      <w:r>
+        <w:rPr>
+          <w:lang w:val="es-CL"/>
+        </w:rPr>
+        <w:t>Facturación mensual: $2.409.000</w:t>
+      </w:r>
+    </w:p>
+    <w:p>
+      <w:pPr>
+        <w:pStyle w:val="Prrafodelista"/>
+        <w:rPr>
+          <w:lang w:val="es-CL"/>
+        </w:rPr>
+      </w:pPr>
+    </w:p>
+    <w:p>
+      <w:pPr>
+        <w:rPr>
+          <w:b/>
+          <w:bCs/>
+          <w:lang w:val="es-CL"/>
+        </w:rPr>
+      </w:pPr>
+      <w:r>
+        <w:rPr>
+          <w:b/>
+          <w:bCs/>
+          <w:lang w:val="es-CL"/>
+        </w:rPr>
+        <w:t>Ingresos de la plataforma</w:t>
+      </w:r>
+    </w:p>
+    <w:p>
+      <w:pPr>
+        <w:pStyle w:val="Prrafodelista"/>
+        <w:numPr>
+          <w:ilvl w:val="0"/>
+          <w:numId w:val="7"/>
+        </w:numPr>
+        <w:rPr>
+          <w:lang w:val="es-CL"/>
+        </w:rPr>
+      </w:pPr>
+      <w:r>
+        <w:rPr>
+          <w:lang w:val="es-CL"/>
+        </w:rPr>
+        <w:t>Comisión por servicio (5%): $550</w:t>
+      </w:r>
+    </w:p>
+    <w:p>
+      <w:pPr>
+        <w:pStyle w:val="Prrafodelista"/>
+        <w:numPr>
+          <w:ilvl w:val="0"/>
+          <w:numId w:val="7"/>
+        </w:numPr>
+        <w:rPr>
+          <w:lang w:val="es-CL"/>
+        </w:rPr>
+      </w:pPr>
+      <w:r>
+        <w:rPr>
+          <w:lang w:val="es-CL"/>
+        </w:rPr>
+        <w:t>219 servicios × $550</w:t>
+      </w:r>
+    </w:p>
+    <w:p>
+      <w:pPr>
+        <w:pStyle w:val="Prrafodelista"/>
+        <w:numPr>
+          <w:ilvl w:val="0"/>
+          <w:numId w:val="7"/>
+        </w:numPr>
+        <w:rPr>
+          <w:lang w:val="es-CL"/>
+        </w:rPr>
+      </w:pPr>
+      <w:r>
+        <w:rPr>
+          <w:lang w:val="es-CL"/>
+        </w:rPr>
+        <w:t>Ingreso mensual por barbería: $120.450</w:t>
+      </w:r>
+    </w:p>
+    <w:p>
+      <w:pPr>
+        <w:pStyle w:val="Prrafodelista"/>
+        <w:rPr>
+          <w:lang w:val="es-CL"/>
+        </w:rPr>
+      </w:pPr>
+    </w:p>
+    <w:p>
+      <w:pPr>
+        <w:rPr>
+          <w:b/>
+          <w:bCs/>
+          <w:lang w:val="es-CL"/>
+        </w:rPr>
+      </w:pPr>
+      <w:r>
+        <w:rPr>
+          <w:b/>
+          <w:bCs/>
+          <w:lang w:val="es-CL"/>
+        </w:rPr>
+        <w:t>Recuperación de la inversión</w:t>
+      </w:r>
+    </w:p>
+    <w:p>
+      <w:pPr>
+        <w:rPr>
+          <w:lang w:val="es-CL"/>
+        </w:rPr>
+      </w:pPr>
+      <w:r>
+        <w:rPr>
+          <w:lang w:val="es-CL"/>
+        </w:rPr>
+        <w:t>Objetivo: Recuperar la inversión en 1 año</w:t>
+      </w:r>
+    </w:p>
+    <w:p>
+      <w:pPr>
+        <w:pStyle w:val="Prrafodelista"/>
+        <w:numPr>
+          <w:ilvl w:val="0"/>
+          <w:numId w:val="8"/>
+        </w:numPr>
+        <w:rPr>
+          <w:lang w:val="es-CL"/>
+        </w:rPr>
+      </w:pPr>
+      <w:r>
+        <w:rPr>
+          <w:lang w:val="es-CL"/>
+        </w:rPr>
+        <w:t>Ingreso necesario por mes: $1.416.667</w:t>
+      </w:r>
+    </w:p>
+    <w:p>
+      <w:pPr>
+        <w:pStyle w:val="Prrafodelista"/>
+        <w:numPr>
+          <w:ilvl w:val="0"/>
+          <w:numId w:val="8"/>
+        </w:numPr>
+        <w:rPr>
+          <w:lang w:val="es-CL"/>
+        </w:rPr>
+      </w:pPr>
+      <w:r>
+        <w:rPr>
+          <w:lang w:val="es-CL"/>
+        </w:rPr>
+        <w:t>Ingreso por barbería: $120.450/mes</w:t>
+      </w:r>
+    </w:p>
+    <w:p>
+      <w:pPr>
+        <w:rPr>
+          <w:lang w:val="es-CL"/>
+        </w:rPr>
+      </w:pPr>
+      <w:r>
+        <w:rPr>
+          <w:highlight w:val="yellow"/>
+          <w:lang w:val="es-CL"/>
+        </w:rPr>
+        <w:t>Se requieren aproximadamente 12 barberías activas.</w:t>
+      </w:r>
+    </w:p>
+    <w:p>
+      <w:pPr>
+        <w:rPr>
+          <w:lang w:val="es-CL"/>
+        </w:rPr>
+      </w:pPr>
+    </w:p>
+    <w:p>
+      <w:pPr>
+        <w:rPr>
+          <w:lang w:val="es-CL"/>
+        </w:rPr>
+      </w:pPr>
+      <w:r>
+        <w:rPr>
+          <w:lang w:val="es-CL"/>
+        </w:rPr>
+        <w:t>Objetivo: Recuperar la inversión en 2 años</w:t>
+      </w:r>
+    </w:p>
+    <w:p>
+      <w:pPr>
+        <w:pStyle w:val="Prrafodelista"/>
+        <w:numPr>
+          <w:ilvl w:val="0"/>
+          <w:numId w:val="9"/>
+        </w:numPr>
+        <w:rPr>
+          <w:lang w:val="es-CL"/>
+        </w:rPr>
+      </w:pPr>
+      <w:r>
+        <w:rPr>
+          <w:lang w:val="es-CL"/>
+        </w:rPr>
+        <w:t>Ingreso necesario por mes: $708.333</w:t>
+      </w:r>
+    </w:p>
+    <w:p>
+      <w:pPr>
+        <w:pStyle w:val="Prrafodelista"/>
+        <w:numPr>
+          <w:ilvl w:val="0"/>
+          <w:numId w:val="9"/>
+        </w:numPr>
+        <w:rPr>
+          <w:lang w:val="es-CL"/>
+        </w:rPr>
+      </w:pPr>
+      <w:r>
+        <w:rPr>
+          <w:lang w:val="es-CL"/>
+        </w:rPr>
+        <w:t>Ingreso por barbería: $120.450/mes</w:t>
+      </w:r>
+    </w:p>
+    <w:p>
+      <w:pPr>
+        <w:rPr>
+          <w:lang w:val="es-CL"/>
+        </w:rPr>
+      </w:pPr>
+      <w:r>
+        <w:rPr>
+          <w:highlight w:val="yellow"/>
+          <w:lang w:val="es-CL"/>
+        </w:rPr>
+        <w:t>Se requieren aproximadamente 6 barberías activas.</w:t>
+      </w:r>
+    </w:p>
+    <w:p>
+      <w:pPr>
+        <w:rPr>
+          <w:lang w:val="es-CL"/>
+        </w:rPr>
+      </w:pPr>
+    </w:p>
+    <w:p>
+      <w:pPr>
+        <w:rPr>
+          <w:lang w:val="es-CL"/>
+        </w:rPr>
+      </w:pPr>
+      <w:r>
+        <w:rPr>
+          <w:lang w:val="es-CL"/>
+        </w:rPr>
+        <w:lastRenderedPageBreak/>
+        <w:t>Resumen</w:t>
       </w:r>
     </w:p>
     <w:tbl>
@@ -2287,49 +2959,46 @@
         <w:tc>
           <w:tcPr>
             <w:tcW w:w="4675" w:type="dxa"/>
-          </w:tcPr>
-          <w:p>
-            <w:pPr>
-              <w:rPr>
-                <w:b/>
-                <w:bCs/>
-                <w:lang w:val="es-CL"/>
-              </w:rPr>
-            </w:pPr>
-            <w:r>
-              <w:rPr>
-                <w:b/>
-                <w:bCs/>
-                <w:lang w:val="es-CL"/>
-              </w:rPr>
-              <w:t>Categoría</w:t>
+            <w:shd w:val="clear" w:color="auto" w:fill="BDD6EE" w:themeFill="accent5" w:themeFillTint="66"/>
+          </w:tcPr>
+          <w:p>
+            <w:pPr>
+              <w:rPr>
+                <w:lang w:val="es-CL"/>
+              </w:rPr>
+            </w:pPr>
+            <w:r>
+              <w:rPr>
+                <w:lang w:val="es-CL"/>
+              </w:rPr>
+              <w:t>CONCEPTO</w:t>
             </w:r>
           </w:p>
         </w:tc>
         <w:tc>
           <w:tcPr>
             <w:tcW w:w="4675" w:type="dxa"/>
-          </w:tcPr>
-          <w:p>
-            <w:pPr>
-              <w:rPr>
-                <w:b/>
-                <w:bCs/>
-                <w:lang w:val="es-CL"/>
-              </w:rPr>
-            </w:pPr>
-            <w:r>
-              <w:rPr>
-                <w:b/>
-                <w:bCs/>
-                <w:lang w:val="es-CL"/>
-              </w:rPr>
-              <w:t>Total</w:t>
+            <w:shd w:val="clear" w:color="auto" w:fill="BDD6EE" w:themeFill="accent5" w:themeFillTint="66"/>
+          </w:tcPr>
+          <w:p>
+            <w:pPr>
+              <w:rPr>
+                <w:lang w:val="es-CL"/>
+              </w:rPr>
+            </w:pPr>
+            <w:r>
+              <w:rPr>
+                <w:lang w:val="es-CL"/>
+              </w:rPr>
+              <w:t>VALOR</w:t>
             </w:r>
           </w:p>
         </w:tc>
       </w:tr>
       <w:tr>
+        <w:trPr>
+          <w:trHeight w:val="397"/>
+        </w:trPr>
         <w:tc>
           <w:tcPr>
             <w:tcW w:w="4675" w:type="dxa"/>
@@ -2344,7 +3013,7 @@
               <w:rPr>
                 <w:lang w:val="es-CL"/>
               </w:rPr>
-              <w:t>Recursos Humanos</w:t>
+              <w:t>Facturación mensual de una barbería</w:t>
             </w:r>
           </w:p>
         </w:tc>
@@ -2359,7 +3028,10 @@
               </w:rPr>
             </w:pPr>
             <w:r>
-              <w:t>$15.600.000</w:t>
+              <w:rPr>
+                <w:lang w:val="es-CL"/>
+              </w:rPr>
+              <w:t>$2.409.000</w:t>
             </w:r>
           </w:p>
         </w:tc>
@@ -2379,7 +3051,7 @@
               <w:rPr>
                 <w:lang w:val="es-CL"/>
               </w:rPr>
-              <w:t>Herramientas</w:t>
+              <w:t>Comisión mensual para la plataforma por barbería</w:t>
             </w:r>
           </w:p>
         </w:tc>
@@ -2397,7 +3069,7 @@
               <w:rPr>
                 <w:lang w:val="es-CL"/>
               </w:rPr>
-              <w:t>$0</w:t>
+              <w:t>$120.450</w:t>
             </w:r>
           </w:p>
         </w:tc>
@@ -2417,7 +3089,7 @@
               <w:rPr>
                 <w:lang w:val="es-CL"/>
               </w:rPr>
-              <w:t>Infraestructura</w:t>
+              <w:t>Barberías activas para recuperar la inversión en 1 año</w:t>
             </w:r>
           </w:p>
         </w:tc>
@@ -2432,10 +3104,10 @@
               </w:rPr>
             </w:pPr>
             <w:r>
-              <w:t>$</w:t>
-            </w:r>
-            <w:r>
-              <w:t>15.000</w:t>
+              <w:rPr>
+                <w:lang w:val="es-CL"/>
+              </w:rPr>
+              <w:t>12</w:t>
             </w:r>
           </w:p>
         </w:tc>
@@ -2455,16 +3127,14 @@
               <w:rPr>
                 <w:lang w:val="es-CL"/>
               </w:rPr>
-              <w:t xml:space="preserve">Pruebas y </w:t>
-            </w:r>
-            <w:proofErr w:type="spellStart"/>
-            <w:r>
-              <w:rPr>
-                <w:lang w:val="es-CL"/>
-              </w:rPr>
-              <w:t>Despligue</w:t>
-            </w:r>
-            <w:proofErr w:type="spellEnd"/>
+              <w:t>Barberías activas para recuperar la inversión en 2 años</w:t>
+            </w:r>
+            <w:r>
+              <w:rPr>
+                <w:lang w:val="es-CL"/>
+              </w:rPr>
+              <w:tab/>
+            </w:r>
           </w:p>
         </w:tc>
         <w:tc>
@@ -2481,45 +3151,7 @@
               <w:rPr>
                 <w:lang w:val="es-CL"/>
               </w:rPr>
-              <w:t>$50.000</w:t>
-            </w:r>
-          </w:p>
-        </w:tc>
-      </w:tr>
-      <w:tr>
-        <w:tc>
-          <w:tcPr>
-            <w:tcW w:w="4675" w:type="dxa"/>
-          </w:tcPr>
-          <w:p>
-            <w:pPr>
-              <w:rPr>
-                <w:lang w:val="es-CL"/>
-              </w:rPr>
-            </w:pPr>
-            <w:r>
-              <w:rPr>
-                <w:lang w:val="es-CL"/>
-              </w:rPr>
-              <w:t xml:space="preserve">Operacionales </w:t>
-            </w:r>
-          </w:p>
-        </w:tc>
-        <w:tc>
-          <w:tcPr>
-            <w:tcW w:w="4675" w:type="dxa"/>
-          </w:tcPr>
-          <w:p>
-            <w:pPr>
-              <w:rPr>
-                <w:lang w:val="es-CL"/>
-              </w:rPr>
-            </w:pPr>
-            <w:r>
-              <w:rPr>
-                <w:lang w:val="es-CL"/>
-              </w:rPr>
-              <w:t>$60.000</w:t>
+              <w:t>6</w:t>
             </w:r>
           </w:p>
         </w:tc>
@@ -2528,6 +3160,90 @@
     <w:p>
       <w:pPr>
         <w:rPr>
+          <w:lang w:val="es-CL"/>
+        </w:rPr>
+      </w:pPr>
+    </w:p>
+    <w:p>
+      <w:pPr>
+        <w:rPr>
+          <w:lang w:val="es-CL"/>
+        </w:rPr>
+      </w:pPr>
+      <w:r>
+        <w:rPr>
+          <w:lang w:val="es-CL"/>
+        </w:rPr>
+        <w:t>Conclusión: Considerando un promedio de 219 servicios mensuales por barbería y un valor promedio de $11.000 por servicio, la plataforma necesitaría aproximadamente 12 barberías activas para recuperar la inversión de $17 millones en 1 año, o 6 barberías activas si el objetivo es recuperarla en 2 años.</w:t>
+      </w:r>
+      <w:r>
+        <w:rPr>
+          <w:lang w:val="es-CL"/>
+        </w:rPr>
+        <w:t xml:space="preserve"> </w:t>
+      </w:r>
+      <w:r>
+        <w:rPr>
+          <w:lang w:val="es-CL"/>
+        </w:rPr>
+        <w:t xml:space="preserve">Sin embargo, considerando la realidad del mercado, el tiempo necesario para captar clientes y lograr una adopción constante de la plataforma, el escenario más probable es recuperar la inversión en un período de </w:t>
+      </w:r>
+      <w:r>
+        <w:rPr>
+          <w:rStyle w:val="Textoennegrita"/>
+          <w:lang w:val="es-CL"/>
+        </w:rPr>
+        <w:t>2 años</w:t>
+      </w:r>
+      <w:r>
+        <w:rPr>
+          <w:lang w:val="es-CL"/>
+        </w:rPr>
+        <w:t xml:space="preserve">, manteniendo alrededor de </w:t>
+      </w:r>
+      <w:r>
+        <w:rPr>
+          <w:rStyle w:val="Textoennegrita"/>
+          <w:lang w:val="es-CL"/>
+        </w:rPr>
+        <w:t>6 barberías activas</w:t>
+      </w:r>
+      <w:r>
+        <w:rPr>
+          <w:lang w:val="es-CL"/>
+        </w:rPr>
+        <w:t xml:space="preserve">. A partir del </w:t>
+      </w:r>
+      <w:r>
+        <w:rPr>
+          <w:rStyle w:val="Textoennegrita"/>
+          <w:lang w:val="es-CL"/>
+        </w:rPr>
+        <w:t>tercer año</w:t>
+      </w:r>
+      <w:r>
+        <w:rPr>
+          <w:lang w:val="es-CL"/>
+        </w:rPr>
+        <w:t xml:space="preserve">, una vez recuperada la inversión inicial, los ingresos generados por las comisiones representarían principalmente </w:t>
+      </w:r>
+      <w:r>
+        <w:rPr>
+          <w:rStyle w:val="Textoennegrita"/>
+          <w:lang w:val="es-CL"/>
+        </w:rPr>
+        <w:t>utilidades para el proyecto</w:t>
+      </w:r>
+      <w:r>
+        <w:rPr>
+          <w:lang w:val="es-CL"/>
+        </w:rPr>
+        <w:t>, descontando los costos operacionales y de mantenimiento correspondientes.</w:t>
+      </w:r>
+    </w:p>
+    <w:p>
+      <w:pPr>
+        <w:rPr>
           <w:b/>
           <w:bCs/>
           <w:lang w:val="es-CL"/>
@@ -2542,23 +3258,21 @@
           <w:lang w:val="es-CL"/>
         </w:rPr>
       </w:pPr>
-      <w:proofErr w:type="gramStart"/>
       <w:r>
         <w:rPr>
           <w:b/>
           <w:bCs/>
           <w:lang w:val="es-CL"/>
         </w:rPr>
-        <w:t>TOTAL</w:t>
-      </w:r>
-      <w:proofErr w:type="gramEnd"/>
+        <w:t>1</w:t>
+      </w:r>
       <w:r>
         <w:rPr>
           <w:b/>
           <w:bCs/>
           <w:lang w:val="es-CL"/>
         </w:rPr>
-        <w:t xml:space="preserve"> GENERAL:</w:t>
+        <w:t>1</w:t>
       </w:r>
       <w:r>
         <w:rPr>
@@ -2566,167 +3280,6 @@
           <w:bCs/>
           <w:lang w:val="es-CL"/>
         </w:rPr>
-        <w:t xml:space="preserve"> </w:t>
-      </w:r>
-      <w:r>
-        <w:rPr>
-          <w:b/>
-          <w:bCs/>
-          <w:lang w:val="es-CL"/>
-        </w:rPr>
-        <w:t>$15.725.000 CLP</w:t>
-      </w:r>
-    </w:p>
-    <w:p>
-      <w:pPr>
-        <w:rPr>
-          <w:b/>
-          <w:bCs/>
-          <w:lang w:val="es-CL"/>
-        </w:rPr>
-      </w:pPr>
-      <w:r>
-        <w:rPr>
-          <w:b/>
-          <w:bCs/>
-          <w:lang w:val="es-CL"/>
-        </w:rPr>
-        <w:t xml:space="preserve">9. </w:t>
-      </w:r>
-      <w:r>
-        <w:rPr>
-          <w:b/>
-          <w:bCs/>
-          <w:lang w:val="es-CL"/>
-        </w:rPr>
-        <w:t>Reserva por Imprevistos (8%)</w:t>
-      </w:r>
-    </w:p>
-    <w:p>
-      <w:pPr>
-        <w:rPr>
-          <w:lang w:val="es-CL"/>
-        </w:rPr>
-      </w:pPr>
-      <w:r>
-        <w:rPr>
-          <w:lang w:val="es-CL"/>
-        </w:rPr>
-        <w:t>Se considera un 8% adicional del costo total del proyecto para cubrir posibles imprevistos, tales como retrasos, errores técnicos o necesidades adicionales.</w:t>
-      </w:r>
-    </w:p>
-    <w:p>
-      <w:pPr>
-        <w:pStyle w:val="Prrafodelista"/>
-        <w:numPr>
-          <w:ilvl w:val="0"/>
-          <w:numId w:val="5"/>
-        </w:numPr>
-        <w:rPr>
-          <w:lang w:val="es-CL"/>
-        </w:rPr>
-      </w:pPr>
-      <w:r>
-        <w:rPr>
-          <w:lang w:val="es-CL"/>
-        </w:rPr>
-        <w:t xml:space="preserve">8% de </w:t>
-      </w:r>
-      <w:r>
-        <w:t>$15.725.000</w:t>
-      </w:r>
-      <w:r>
-        <w:t xml:space="preserve"> </w:t>
-      </w:r>
-      <w:r>
-        <w:rPr>
-          <w:lang w:val="es-CL"/>
-        </w:rPr>
-        <w:t xml:space="preserve">= </w:t>
-      </w:r>
-      <w:r>
-        <w:t>$1.258.000</w:t>
-      </w:r>
-      <w:r>
-        <w:t xml:space="preserve"> </w:t>
-      </w:r>
-      <w:r>
-        <w:rPr>
-          <w:lang w:val="es-CL"/>
-        </w:rPr>
-        <w:t>CLP</w:t>
-      </w:r>
-    </w:p>
-    <w:p>
-      <w:pPr>
-        <w:rPr>
-          <w:lang w:val="es-CL"/>
-        </w:rPr>
-      </w:pPr>
-    </w:p>
-    <w:p>
-      <w:pPr>
-        <w:rPr>
-          <w:u w:val="single"/>
-          <w:lang w:val="es-CL"/>
-        </w:rPr>
-      </w:pPr>
-      <w:r>
-        <w:rPr>
-          <w:u w:val="single"/>
-          <w:lang w:val="es-CL"/>
-        </w:rPr>
-        <w:t>COSTO TOTAL FINAL DEL PROYECTO</w:t>
-      </w:r>
-    </w:p>
-    <w:p>
-      <w:pPr>
-        <w:rPr>
-          <w:b/>
-          <w:bCs/>
-          <w:lang w:val="es-CL"/>
-        </w:rPr>
-      </w:pPr>
-      <w:r>
-        <w:rPr>
-          <w:b/>
-          <w:bCs/>
-          <w:lang w:val="es-CL"/>
-        </w:rPr>
-        <w:t>$16.983.000 CLP</w:t>
-      </w:r>
-    </w:p>
-    <w:p>
-      <w:pPr>
-        <w:rPr>
-          <w:b/>
-          <w:bCs/>
-          <w:lang w:val="es-CL"/>
-        </w:rPr>
-      </w:pPr>
-    </w:p>
-    <w:p>
-      <w:pPr>
-        <w:rPr>
-          <w:b/>
-          <w:bCs/>
-          <w:lang w:val="es-CL"/>
-        </w:rPr>
-      </w:pPr>
-      <w:r>
-        <w:rPr>
-          <w:b/>
-          <w:bCs/>
-          <w:lang w:val="es-CL"/>
-        </w:rPr>
-        <w:t>10</w:t>
-      </w:r>
-      <w:r>
-        <w:rPr>
-          <w:b/>
-          <w:bCs/>
-          <w:lang w:val="es-CL"/>
-        </w:rPr>
         <w:t>. Conclusión</w:t>
       </w:r>
     </w:p>
@@ -2754,33 +3307,47 @@
         <w:rPr>
           <w:lang w:val="es-CL"/>
         </w:rPr>
-        <w:t xml:space="preserve"> implica una inversión aproximada de $15.725.000 CLP, considerando todas las etapas del proyecto, incluyendo análisis, diseño, desarrollo y pruebas.</w:t>
-      </w:r>
-    </w:p>
-    <w:p>
-      <w:pPr>
-        <w:rPr>
-          <w:lang w:val="es-CL"/>
-        </w:rPr>
-      </w:pPr>
-      <w:r>
-        <w:rPr>
-          <w:lang w:val="es-CL"/>
-        </w:rPr>
-        <w:t>La incorporación del rol de analista permite una mejor definición de los requerimientos y arquitectura del sistema, asegurando una base sólida para el desarrollo.</w:t>
-      </w:r>
-    </w:p>
-    <w:p>
-      <w:pPr>
-        <w:rPr>
-          <w:lang w:val="es-CL"/>
-        </w:rPr>
-      </w:pPr>
-      <w:r>
-        <w:rPr>
-          <w:lang w:val="es-CL"/>
-        </w:rPr>
-        <w:t>El uso de herramientas gratuitas permite reducir costos tecnológicos, concentrando la inversión en el capital humano.</w:t>
+        <w:t xml:space="preserve"> requiere una inversión total estimada de $16.983.000 CLP, considerando los costos de recursos humanos, infraestructura, pruebas, operación y una reserva para imprevistos. La utilización de herramientas gratuitas y beneficios estudiantiles, como los créditos de Azure y SQL Server, permite optimizar los costos tecnológicos, concentrando la mayor parte de la inversión en el desarrollo del software y el capital humano.</w:t>
+      </w:r>
+    </w:p>
+    <w:p>
+      <w:pPr>
+        <w:rPr>
+          <w:lang w:val="es-CL"/>
+        </w:rPr>
+      </w:pPr>
+      <w:r>
+        <w:rPr>
+          <w:lang w:val="es-CL"/>
+        </w:rPr>
+        <w:t>De acuerdo con la proyección financiera realizada, considerando una comisión del 5%, un valor promedio de $11.000 por servicio y un promedio de 219 servicios mensuales por barbería, la plataforma generaría un ingreso aproximado de $120.450 mensuales por cada barbería activa.</w:t>
+      </w:r>
+    </w:p>
+    <w:p>
+      <w:pPr>
+        <w:rPr>
+          <w:lang w:val="es-CL"/>
+        </w:rPr>
+      </w:pPr>
+      <w:r>
+        <w:rPr>
+          <w:lang w:val="es-CL"/>
+        </w:rPr>
+        <w:t xml:space="preserve">Si bien teóricamente la inversión podría recuperarse en un año con 12 barberías activas, considerando el tiempo necesario para posicionar la plataforma en el mercado, captar clientes y consolidar una base estable de usuarios, el escenario más realista es proyectar la recuperación de la inversión en un plazo de 2 años, con alrededor de 6 barberías activas. En este escenario, el tercer año marcaría el inicio de la etapa de generación de utilidades, permitiendo además reinvertir en nuevas funcionalidades, marketing y expansión del proyecto, consolidando a </w:t>
+      </w:r>
+      <w:proofErr w:type="spellStart"/>
+      <w:r>
+        <w:rPr>
+          <w:lang w:val="es-CL"/>
+        </w:rPr>
+        <w:t>FadeBooker</w:t>
+      </w:r>
+      <w:proofErr w:type="spellEnd"/>
+      <w:r>
+        <w:rPr>
+          <w:lang w:val="es-CL"/>
+        </w:rPr>
+        <w:t xml:space="preserve"> como una solución sostenible y con potencial de crecimiento en el mercado de barberías y peluquerías.</w:t>
       </w:r>
     </w:p>
     <w:sectPr>
@@ -2848,7 +3415,7 @@
   <w:abstractNum w:abstractNumId="0" w15:restartNumberingAfterBreak="0">
     <w:nsid w:val="00420A50"/>
     <w:multiLevelType w:val="hybridMultilevel"/>
-    <w:tmpl w:val="BE3ED6F8"/>
+    <w:tmpl w:val="B3B6C62C"/>
     <w:lvl w:ilvl="0" w:tplc="04090001">
       <w:start w:val="1"/>
       <w:numFmt w:val="bullet"/>
@@ -3072,6 +3639,232 @@
     </w:lvl>
   </w:abstractNum>
   <w:abstractNum w:abstractNumId="2" w15:restartNumberingAfterBreak="0">
+    <w:nsid w:val="0DA64ABF"/>
+    <w:multiLevelType w:val="hybridMultilevel"/>
+    <w:tmpl w:val="AB9C0C34"/>
+    <w:lvl w:ilvl="0" w:tplc="04090001">
+      <w:start w:val="1"/>
+      <w:numFmt w:val="bullet"/>
+      <w:lvlText w:val=""/>
+      <w:lvlJc w:val="left"/>
+      <w:pPr>
+        <w:ind w:left="720" w:hanging="360"/>
+      </w:pPr>
+      <w:rPr>
+        <w:rFonts w:ascii="Symbol" w:hAnsi="Symbol" w:hint="default"/>
+      </w:rPr>
+    </w:lvl>
+    <w:lvl w:ilvl="1" w:tplc="04090003" w:tentative="1">
+      <w:start w:val="1"/>
+      <w:numFmt w:val="bullet"/>
+      <w:lvlText w:val="o"/>
+      <w:lvlJc w:val="left"/>
+      <w:pPr>
+        <w:ind w:left="1440" w:hanging="360"/>
+      </w:pPr>
+      <w:rPr>
+        <w:rFonts w:ascii="Courier New" w:hAnsi="Courier New" w:cs="Courier New" w:hint="default"/>
+      </w:rPr>
+    </w:lvl>
+    <w:lvl w:ilvl="2" w:tplc="04090005" w:tentative="1">
+      <w:start w:val="1"/>
+      <w:numFmt w:val="bullet"/>
+      <w:lvlText w:val=""/>
+      <w:lvlJc w:val="left"/>
+      <w:pPr>
+        <w:ind w:left="2160" w:hanging="360"/>
+      </w:pPr>
+      <w:rPr>
+        <w:rFonts w:ascii="Wingdings" w:hAnsi="Wingdings" w:hint="default"/>
+      </w:rPr>
+    </w:lvl>
+    <w:lvl w:ilvl="3" w:tplc="04090001" w:tentative="1">
+      <w:start w:val="1"/>
+      <w:numFmt w:val="bullet"/>
+      <w:lvlText w:val=""/>
+      <w:lvlJc w:val="left"/>
+      <w:pPr>
+        <w:ind w:left="2880" w:hanging="360"/>
+      </w:pPr>
+      <w:rPr>
+        <w:rFonts w:ascii="Symbol" w:hAnsi="Symbol" w:hint="default"/>
+      </w:rPr>
+    </w:lvl>
+    <w:lvl w:ilvl="4" w:tplc="04090003" w:tentative="1">
+      <w:start w:val="1"/>
+      <w:numFmt w:val="bullet"/>
+      <w:lvlText w:val="o"/>
+      <w:lvlJc w:val="left"/>
+      <w:pPr>
+        <w:ind w:left="3600" w:hanging="360"/>
+      </w:pPr>
+      <w:rPr>
+        <w:rFonts w:ascii="Courier New" w:hAnsi="Courier New" w:cs="Courier New" w:hint="default"/>
+      </w:rPr>
+    </w:lvl>
+    <w:lvl w:ilvl="5" w:tplc="04090005" w:tentative="1">
+      <w:start w:val="1"/>
+      <w:numFmt w:val="bullet"/>
+      <w:lvlText w:val=""/>
+      <w:lvlJc w:val="left"/>
+      <w:pPr>
+        <w:ind w:left="4320" w:hanging="360"/>
+      </w:pPr>
+      <w:rPr>
+        <w:rFonts w:ascii="Wingdings" w:hAnsi="Wingdings" w:hint="default"/>
+      </w:rPr>
+    </w:lvl>
+    <w:lvl w:ilvl="6" w:tplc="04090001" w:tentative="1">
+      <w:start w:val="1"/>
+      <w:numFmt w:val="bullet"/>
+      <w:lvlText w:val=""/>
+      <w:lvlJc w:val="left"/>
+      <w:pPr>
+        <w:ind w:left="5040" w:hanging="360"/>
+      </w:pPr>
+      <w:rPr>
+        <w:rFonts w:ascii="Symbol" w:hAnsi="Symbol" w:hint="default"/>
+      </w:rPr>
+    </w:lvl>
+    <w:lvl w:ilvl="7" w:tplc="04090003" w:tentative="1">
+      <w:start w:val="1"/>
+      <w:numFmt w:val="bullet"/>
+      <w:lvlText w:val="o"/>
+      <w:lvlJc w:val="left"/>
+      <w:pPr>
+        <w:ind w:left="5760" w:hanging="360"/>
+      </w:pPr>
+      <w:rPr>
+        <w:rFonts w:ascii="Courier New" w:hAnsi="Courier New" w:cs="Courier New" w:hint="default"/>
+      </w:rPr>
+    </w:lvl>
+    <w:lvl w:ilvl="8" w:tplc="04090005" w:tentative="1">
+      <w:start w:val="1"/>
+      <w:numFmt w:val="bullet"/>
+      <w:lvlText w:val=""/>
+      <w:lvlJc w:val="left"/>
+      <w:pPr>
+        <w:ind w:left="6480" w:hanging="360"/>
+      </w:pPr>
+      <w:rPr>
+        <w:rFonts w:ascii="Wingdings" w:hAnsi="Wingdings" w:hint="default"/>
+      </w:rPr>
+    </w:lvl>
+  </w:abstractNum>
+  <w:abstractNum w:abstractNumId="3" w15:restartNumberingAfterBreak="0">
+    <w:nsid w:val="117A3359"/>
+    <w:multiLevelType w:val="hybridMultilevel"/>
+    <w:tmpl w:val="2F8EB810"/>
+    <w:lvl w:ilvl="0" w:tplc="04090001">
+      <w:start w:val="1"/>
+      <w:numFmt w:val="bullet"/>
+      <w:lvlText w:val=""/>
+      <w:lvlJc w:val="left"/>
+      <w:pPr>
+        <w:ind w:left="720" w:hanging="360"/>
+      </w:pPr>
+      <w:rPr>
+        <w:rFonts w:ascii="Symbol" w:hAnsi="Symbol" w:hint="default"/>
+      </w:rPr>
+    </w:lvl>
+    <w:lvl w:ilvl="1" w:tplc="04090003" w:tentative="1">
+      <w:start w:val="1"/>
+      <w:numFmt w:val="bullet"/>
+      <w:lvlText w:val="o"/>
+      <w:lvlJc w:val="left"/>
+      <w:pPr>
+        <w:ind w:left="1440" w:hanging="360"/>
+      </w:pPr>
+      <w:rPr>
+        <w:rFonts w:ascii="Courier New" w:hAnsi="Courier New" w:cs="Courier New" w:hint="default"/>
+      </w:rPr>
+    </w:lvl>
+    <w:lvl w:ilvl="2" w:tplc="04090005" w:tentative="1">
+      <w:start w:val="1"/>
+      <w:numFmt w:val="bullet"/>
+      <w:lvlText w:val=""/>
+      <w:lvlJc w:val="left"/>
+      <w:pPr>
+        <w:ind w:left="2160" w:hanging="360"/>
+      </w:pPr>
+      <w:rPr>
+        <w:rFonts w:ascii="Wingdings" w:hAnsi="Wingdings" w:hint="default"/>
+      </w:rPr>
+    </w:lvl>
+    <w:lvl w:ilvl="3" w:tplc="04090001" w:tentative="1">
+      <w:start w:val="1"/>
+      <w:numFmt w:val="bullet"/>
+      <w:lvlText w:val=""/>
+      <w:lvlJc w:val="left"/>
+      <w:pPr>
+        <w:ind w:left="2880" w:hanging="360"/>
+      </w:pPr>
+      <w:rPr>
+        <w:rFonts w:ascii="Symbol" w:hAnsi="Symbol" w:hint="default"/>
+      </w:rPr>
+    </w:lvl>
+    <w:lvl w:ilvl="4" w:tplc="04090003" w:tentative="1">
+      <w:start w:val="1"/>
+      <w:numFmt w:val="bullet"/>
+      <w:lvlText w:val="o"/>
+      <w:lvlJc w:val="left"/>
+      <w:pPr>
+        <w:ind w:left="3600" w:hanging="360"/>
+      </w:pPr>
+      <w:rPr>
+        <w:rFonts w:ascii="Courier New" w:hAnsi="Courier New" w:cs="Courier New" w:hint="default"/>
+      </w:rPr>
+    </w:lvl>
+    <w:lvl w:ilvl="5" w:tplc="04090005" w:tentative="1">
+      <w:start w:val="1"/>
+      <w:numFmt w:val="bullet"/>
+      <w:lvlText w:val=""/>
+      <w:lvlJc w:val="left"/>
+      <w:pPr>
+        <w:ind w:left="4320" w:hanging="360"/>
+      </w:pPr>
+      <w:rPr>
+        <w:rFonts w:ascii="Wingdings" w:hAnsi="Wingdings" w:hint="default"/>
+      </w:rPr>
+    </w:lvl>
+    <w:lvl w:ilvl="6" w:tplc="04090001" w:tentative="1">
+      <w:start w:val="1"/>
+      <w:numFmt w:val="bullet"/>
+      <w:lvlText w:val=""/>
+      <w:lvlJc w:val="left"/>
+      <w:pPr>
+        <w:ind w:left="5040" w:hanging="360"/>
+      </w:pPr>
+      <w:rPr>
+        <w:rFonts w:ascii="Symbol" w:hAnsi="Symbol" w:hint="default"/>
+      </w:rPr>
+    </w:lvl>
+    <w:lvl w:ilvl="7" w:tplc="04090003" w:tentative="1">
+      <w:start w:val="1"/>
+      <w:numFmt w:val="bullet"/>
+      <w:lvlText w:val="o"/>
+      <w:lvlJc w:val="left"/>
+      <w:pPr>
+        <w:ind w:left="5760" w:hanging="360"/>
+      </w:pPr>
+      <w:rPr>
+        <w:rFonts w:ascii="Courier New" w:hAnsi="Courier New" w:cs="Courier New" w:hint="default"/>
+      </w:rPr>
+    </w:lvl>
+    <w:lvl w:ilvl="8" w:tplc="04090005" w:tentative="1">
+      <w:start w:val="1"/>
+      <w:numFmt w:val="bullet"/>
+      <w:lvlText w:val=""/>
+      <w:lvlJc w:val="left"/>
+      <w:pPr>
+        <w:ind w:left="6480" w:hanging="360"/>
+      </w:pPr>
+      <w:rPr>
+        <w:rFonts w:ascii="Wingdings" w:hAnsi="Wingdings" w:hint="default"/>
+      </w:rPr>
+    </w:lvl>
+  </w:abstractNum>
+  <w:abstractNum w:abstractNumId="4" w15:restartNumberingAfterBreak="0">
     <w:nsid w:val="2F2D18DD"/>
     <w:multiLevelType w:val="hybridMultilevel"/>
     <w:tmpl w:val="279CE2F0"/>
@@ -3184,7 +3977,7 @@
       </w:rPr>
     </w:lvl>
   </w:abstractNum>
-  <w:abstractNum w:abstractNumId="3" w15:restartNumberingAfterBreak="0">
+  <w:abstractNum w:abstractNumId="5" w15:restartNumberingAfterBreak="0">
     <w:nsid w:val="32285831"/>
     <w:multiLevelType w:val="hybridMultilevel"/>
     <w:tmpl w:val="2C643CBC"/>
@@ -3297,7 +4090,233 @@
       </w:rPr>
     </w:lvl>
   </w:abstractNum>
-  <w:abstractNum w:abstractNumId="4" w15:restartNumberingAfterBreak="0">
+  <w:abstractNum w:abstractNumId="6" w15:restartNumberingAfterBreak="0">
+    <w:nsid w:val="5099312F"/>
+    <w:multiLevelType w:val="hybridMultilevel"/>
+    <w:tmpl w:val="07DA9A6E"/>
+    <w:lvl w:ilvl="0" w:tplc="04090001">
+      <w:start w:val="1"/>
+      <w:numFmt w:val="bullet"/>
+      <w:lvlText w:val=""/>
+      <w:lvlJc w:val="left"/>
+      <w:pPr>
+        <w:ind w:left="720" w:hanging="360"/>
+      </w:pPr>
+      <w:rPr>
+        <w:rFonts w:ascii="Symbol" w:hAnsi="Symbol" w:hint="default"/>
+      </w:rPr>
+    </w:lvl>
+    <w:lvl w:ilvl="1" w:tplc="04090003" w:tentative="1">
+      <w:start w:val="1"/>
+      <w:numFmt w:val="bullet"/>
+      <w:lvlText w:val="o"/>
+      <w:lvlJc w:val="left"/>
+      <w:pPr>
+        <w:ind w:left="1440" w:hanging="360"/>
+      </w:pPr>
+      <w:rPr>
+        <w:rFonts w:ascii="Courier New" w:hAnsi="Courier New" w:cs="Courier New" w:hint="default"/>
+      </w:rPr>
+    </w:lvl>
+    <w:lvl w:ilvl="2" w:tplc="04090005" w:tentative="1">
+      <w:start w:val="1"/>
+      <w:numFmt w:val="bullet"/>
+      <w:lvlText w:val=""/>
+      <w:lvlJc w:val="left"/>
+      <w:pPr>
+        <w:ind w:left="2160" w:hanging="360"/>
+      </w:pPr>
+      <w:rPr>
+        <w:rFonts w:ascii="Wingdings" w:hAnsi="Wingdings" w:hint="default"/>
+      </w:rPr>
+    </w:lvl>
+    <w:lvl w:ilvl="3" w:tplc="04090001" w:tentative="1">
+      <w:start w:val="1"/>
+      <w:numFmt w:val="bullet"/>
+      <w:lvlText w:val=""/>
+      <w:lvlJc w:val="left"/>
+      <w:pPr>
+        <w:ind w:left="2880" w:hanging="360"/>
+      </w:pPr>
+      <w:rPr>
+        <w:rFonts w:ascii="Symbol" w:hAnsi="Symbol" w:hint="default"/>
+      </w:rPr>
+    </w:lvl>
+    <w:lvl w:ilvl="4" w:tplc="04090003" w:tentative="1">
+      <w:start w:val="1"/>
+      <w:numFmt w:val="bullet"/>
+      <w:lvlText w:val="o"/>
+      <w:lvlJc w:val="left"/>
+      <w:pPr>
+        <w:ind w:left="3600" w:hanging="360"/>
+      </w:pPr>
+      <w:rPr>
+        <w:rFonts w:ascii="Courier New" w:hAnsi="Courier New" w:cs="Courier New" w:hint="default"/>
+      </w:rPr>
+    </w:lvl>
+    <w:lvl w:ilvl="5" w:tplc="04090005" w:tentative="1">
+      <w:start w:val="1"/>
+      <w:numFmt w:val="bullet"/>
+      <w:lvlText w:val=""/>
+      <w:lvlJc w:val="left"/>
+      <w:pPr>
+        <w:ind w:left="4320" w:hanging="360"/>
+      </w:pPr>
+      <w:rPr>
+        <w:rFonts w:ascii="Wingdings" w:hAnsi="Wingdings" w:hint="default"/>
+      </w:rPr>
+    </w:lvl>
+    <w:lvl w:ilvl="6" w:tplc="04090001" w:tentative="1">
+      <w:start w:val="1"/>
+      <w:numFmt w:val="bullet"/>
+      <w:lvlText w:val=""/>
+      <w:lvlJc w:val="left"/>
+      <w:pPr>
+        <w:ind w:left="5040" w:hanging="360"/>
+      </w:pPr>
+      <w:rPr>
+        <w:rFonts w:ascii="Symbol" w:hAnsi="Symbol" w:hint="default"/>
+      </w:rPr>
+    </w:lvl>
+    <w:lvl w:ilvl="7" w:tplc="04090003" w:tentative="1">
+      <w:start w:val="1"/>
+      <w:numFmt w:val="bullet"/>
+      <w:lvlText w:val="o"/>
+      <w:lvlJc w:val="left"/>
+      <w:pPr>
+        <w:ind w:left="5760" w:hanging="360"/>
+      </w:pPr>
+      <w:rPr>
+        <w:rFonts w:ascii="Courier New" w:hAnsi="Courier New" w:cs="Courier New" w:hint="default"/>
+      </w:rPr>
+    </w:lvl>
+    <w:lvl w:ilvl="8" w:tplc="04090005" w:tentative="1">
+      <w:start w:val="1"/>
+      <w:numFmt w:val="bullet"/>
+      <w:lvlText w:val=""/>
+      <w:lvlJc w:val="left"/>
+      <w:pPr>
+        <w:ind w:left="6480" w:hanging="360"/>
+      </w:pPr>
+      <w:rPr>
+        <w:rFonts w:ascii="Wingdings" w:hAnsi="Wingdings" w:hint="default"/>
+      </w:rPr>
+    </w:lvl>
+  </w:abstractNum>
+  <w:abstractNum w:abstractNumId="7" w15:restartNumberingAfterBreak="0">
+    <w:nsid w:val="5A5C4328"/>
+    <w:multiLevelType w:val="hybridMultilevel"/>
+    <w:tmpl w:val="521A1852"/>
+    <w:lvl w:ilvl="0" w:tplc="04090001">
+      <w:start w:val="1"/>
+      <w:numFmt w:val="bullet"/>
+      <w:lvlText w:val=""/>
+      <w:lvlJc w:val="left"/>
+      <w:pPr>
+        <w:ind w:left="720" w:hanging="360"/>
+      </w:pPr>
+      <w:rPr>
+        <w:rFonts w:ascii="Symbol" w:hAnsi="Symbol" w:hint="default"/>
+      </w:rPr>
+    </w:lvl>
+    <w:lvl w:ilvl="1" w:tplc="04090003" w:tentative="1">
+      <w:start w:val="1"/>
+      <w:numFmt w:val="bullet"/>
+      <w:lvlText w:val="o"/>
+      <w:lvlJc w:val="left"/>
+      <w:pPr>
+        <w:ind w:left="1440" w:hanging="360"/>
+      </w:pPr>
+      <w:rPr>
+        <w:rFonts w:ascii="Courier New" w:hAnsi="Courier New" w:cs="Courier New" w:hint="default"/>
+      </w:rPr>
+    </w:lvl>
+    <w:lvl w:ilvl="2" w:tplc="04090005" w:tentative="1">
+      <w:start w:val="1"/>
+      <w:numFmt w:val="bullet"/>
+      <w:lvlText w:val=""/>
+      <w:lvlJc w:val="left"/>
+      <w:pPr>
+        <w:ind w:left="2160" w:hanging="360"/>
+      </w:pPr>
+      <w:rPr>
+        <w:rFonts w:ascii="Wingdings" w:hAnsi="Wingdings" w:hint="default"/>
+      </w:rPr>
+    </w:lvl>
+    <w:lvl w:ilvl="3" w:tplc="04090001" w:tentative="1">
+      <w:start w:val="1"/>
+      <w:numFmt w:val="bullet"/>
+      <w:lvlText w:val=""/>
+      <w:lvlJc w:val="left"/>
+      <w:pPr>
+        <w:ind w:left="2880" w:hanging="360"/>
+      </w:pPr>
+      <w:rPr>
+        <w:rFonts w:ascii="Symbol" w:hAnsi="Symbol" w:hint="default"/>
+      </w:rPr>
+    </w:lvl>
+    <w:lvl w:ilvl="4" w:tplc="04090003" w:tentative="1">
+      <w:start w:val="1"/>
+      <w:numFmt w:val="bullet"/>
+      <w:lvlText w:val="o"/>
+      <w:lvlJc w:val="left"/>
+      <w:pPr>
+        <w:ind w:left="3600" w:hanging="360"/>
+      </w:pPr>
+      <w:rPr>
+        <w:rFonts w:ascii="Courier New" w:hAnsi="Courier New" w:cs="Courier New" w:hint="default"/>
+      </w:rPr>
+    </w:lvl>
+    <w:lvl w:ilvl="5" w:tplc="04090005" w:tentative="1">
+      <w:start w:val="1"/>
+      <w:numFmt w:val="bullet"/>
+      <w:lvlText w:val=""/>
+      <w:lvlJc w:val="left"/>
+      <w:pPr>
+        <w:ind w:left="4320" w:hanging="360"/>
+      </w:pPr>
+      <w:rPr>
+        <w:rFonts w:ascii="Wingdings" w:hAnsi="Wingdings" w:hint="default"/>
+      </w:rPr>
+    </w:lvl>
+    <w:lvl w:ilvl="6" w:tplc="04090001" w:tentative="1">
+      <w:start w:val="1"/>
+      <w:numFmt w:val="bullet"/>
+      <w:lvlText w:val=""/>
+      <w:lvlJc w:val="left"/>
+      <w:pPr>
+        <w:ind w:left="5040" w:hanging="360"/>
+      </w:pPr>
+      <w:rPr>
+        <w:rFonts w:ascii="Symbol" w:hAnsi="Symbol" w:hint="default"/>
+      </w:rPr>
+    </w:lvl>
+    <w:lvl w:ilvl="7" w:tplc="04090003" w:tentative="1">
+      <w:start w:val="1"/>
+      <w:numFmt w:val="bullet"/>
+      <w:lvlText w:val="o"/>
+      <w:lvlJc w:val="left"/>
+      <w:pPr>
+        <w:ind w:left="5760" w:hanging="360"/>
+      </w:pPr>
+      <w:rPr>
+        <w:rFonts w:ascii="Courier New" w:hAnsi="Courier New" w:cs="Courier New" w:hint="default"/>
+      </w:rPr>
+    </w:lvl>
+    <w:lvl w:ilvl="8" w:tplc="04090005" w:tentative="1">
+      <w:start w:val="1"/>
+      <w:numFmt w:val="bullet"/>
+      <w:lvlText w:val=""/>
+      <w:lvlJc w:val="left"/>
+      <w:pPr>
+        <w:ind w:left="6480" w:hanging="360"/>
+      </w:pPr>
+      <w:rPr>
+        <w:rFonts w:ascii="Wingdings" w:hAnsi="Wingdings" w:hint="default"/>
+      </w:rPr>
+    </w:lvl>
+  </w:abstractNum>
+  <w:abstractNum w:abstractNumId="8" w15:restartNumberingAfterBreak="0">
     <w:nsid w:val="69925BE6"/>
     <w:multiLevelType w:val="hybridMultilevel"/>
     <w:tmpl w:val="962C7CF6"/>
@@ -3411,19 +4430,31 @@
     </w:lvl>
   </w:abstractNum>
   <w:num w:numId="1">
-    <w:abstractNumId w:val="3"/>
+    <w:abstractNumId w:val="5"/>
   </w:num>
   <w:num w:numId="2">
     <w:abstractNumId w:val="1"/>
   </w:num>
   <w:num w:numId="3">
-    <w:abstractNumId w:val="2"/>
+    <w:abstractNumId w:val="4"/>
   </w:num>
   <w:num w:numId="4">
-    <w:abstractNumId w:val="4"/>
+    <w:abstractNumId w:val="8"/>
   </w:num>
   <w:num w:numId="5">
     <w:abstractNumId w:val="0"/>
+  </w:num>
+  <w:num w:numId="6">
+    <w:abstractNumId w:val="7"/>
+  </w:num>
+  <w:num w:numId="7">
+    <w:abstractNumId w:val="6"/>
+  </w:num>
+  <w:num w:numId="8">
+    <w:abstractNumId w:val="3"/>
+  </w:num>
+  <w:num w:numId="9">
+    <w:abstractNumId w:val="2"/>
   </w:num>
 </w:numbering>
 </file>
@@ -3872,9 +4903,33 @@
       <w14:ligatures w14:val="none"/>
     </w:rPr>
   </w:style>
+  <w:style w:type="paragraph" w:styleId="Ttulo3">
+    <w:name w:val="heading 3"/>
+    <w:basedOn w:val="Normal"/>
+    <w:next w:val="Normal"/>
+    <w:link w:val="Ttulo3Car"/>
+    <w:uiPriority w:val="9"/>
+    <w:semiHidden/>
+    <w:unhideWhenUsed/>
+    <w:qFormat/>
+    <w:rsid w:val="00ED5FE5"/>
+    <w:pPr>
+      <w:keepNext/>
+      <w:keepLines/>
+      <w:spacing w:before="40" w:after="0"/>
+      <w:outlineLvl w:val="2"/>
+    </w:pPr>
+    <w:rPr>
+      <w:rFonts w:asciiTheme="majorHAnsi" w:eastAsiaTheme="majorEastAsia" w:hAnsiTheme="majorHAnsi" w:cstheme="majorBidi"/>
+      <w:color w:val="1F3763" w:themeColor="accent1" w:themeShade="7F"/>
+      <w:sz w:val="24"/>
+      <w:szCs w:val="24"/>
+    </w:rPr>
+  </w:style>
   <w:style w:type="character" w:default="1" w:styleId="Fuentedeprrafopredeter">
     <w:name w:val="Default Paragraph Font"/>
     <w:uiPriority w:val="1"/>
+    <w:semiHidden/>
     <w:unhideWhenUsed/>
   </w:style>
   <w:style w:type="table" w:default="1" w:styleId="Tablanormal">
@@ -4195,6 +5250,20 @@
       <w:color w:val="2F5496" w:themeColor="accent1" w:themeShade="BF"/>
       <w:sz w:val="32"/>
       <w:szCs w:val="32"/>
+    </w:rPr>
+  </w:style>
+  <w:style w:type="character" w:customStyle="1" w:styleId="Ttulo3Car">
+    <w:name w:val="Título 3 Car"/>
+    <w:basedOn w:val="Fuentedeprrafopredeter"/>
+    <w:link w:val="Ttulo3"/>
+    <w:uiPriority w:val="9"/>
+    <w:semiHidden/>
+    <w:rsid w:val="00ED5FE5"/>
+    <w:rPr>
+      <w:rFonts w:asciiTheme="majorHAnsi" w:eastAsiaTheme="majorEastAsia" w:hAnsiTheme="majorHAnsi" w:cstheme="majorBidi"/>
+      <w:color w:val="1F3763" w:themeColor="accent1" w:themeShade="7F"/>
+      <w:sz w:val="24"/>
+      <w:szCs w:val="24"/>
     </w:rPr>
   </w:style>
 </w:styles>

</xml_diff>